<commit_message>
Rilievi TEST_PORTALE_CWP (T01-T29 tranne Marketing): script 48, pagine, prove e documenti
Co-Authored-By: Claude Opus 5.5 <noreply@anthropic.com>
Claude-Session: https://claude.ai/code/session_01E8XCbEeVHWVP3hntUZ6kZ1
</commit_message>
<xml_diff>
--- a/public/documentazione/DPIA_Banca_Dati_Utenze_Portale_CWP.docx
+++ b/public/documentazione/DPIA_Banca_Dati_Utenze_Portale_CWP.docx
@@ -302,7 +302,7 @@
                 <w:sz w:val="20"/>
                 <w:szCs w:val="20"/>
               </w:rPr>
-              <w:t xml:space="preserve">Rev. 1.0</w:t>
+              <w:t xml:space="preserve">Rev. 1.1</w:t>
             </w:r>
           </w:p>
         </w:tc>
@@ -365,7 +365,7 @@
                 <w:sz w:val="20"/>
                 <w:szCs w:val="20"/>
               </w:rPr>
-              <w:t xml:space="preserve">26/10/2026</w:t>
+              <w:t xml:space="preserve">30/10/2026</w:t>
             </w:r>
           </w:p>
         </w:tc>
@@ -719,6 +719,140 @@
                 <w:sz w:val="18"/>
                 <w:szCs w:val="18"/>
               </w:rPr>
+              <w:t xml:space="preserve">1.1</w:t>
+            </w:r>
+          </w:p>
+        </w:tc>
+        <w:tc>
+          <w:tcPr>
+            <w:tcW w:type="dxa" w:w="1300"/>
+            <w:tcBorders>
+              <w:top w:val="single" w:color="D9D4C5" w:sz="4"/>
+              <w:left w:val="single" w:color="D9D4C5" w:sz="4"/>
+              <w:bottom w:val="single" w:color="D9D4C5" w:sz="4"/>
+              <w:right w:val="single" w:color="D9D4C5" w:sz="4"/>
+            </w:tcBorders>
+            <w:tcMar>
+              <w:top w:type="dxa" w:w="70"/>
+              <w:left w:type="dxa" w:w="110"/>
+              <w:bottom w:type="dxa" w:w="70"/>
+              <w:right w:type="dxa" w:w="110"/>
+            </w:tcMar>
+            <w:vAlign w:val="center"/>
+          </w:tcPr>
+          <w:p>
+            <w:pPr>
+              <w:spacing w:after="0" w:before="0"/>
+            </w:pPr>
+            <w:r>
+              <w:rPr>
+                <w:rFonts w:ascii="Arial" w:cs="Arial" w:eastAsia="Arial" w:hAnsi="Arial"/>
+                <w:color w:val="1B2118"/>
+                <w:sz w:val="18"/>
+                <w:szCs w:val="18"/>
+              </w:rPr>
+              <w:t xml:space="preserve">30/10/2026</w:t>
+            </w:r>
+          </w:p>
+        </w:tc>
+        <w:tc>
+          <w:tcPr>
+            <w:tcW w:type="dxa" w:w="5538"/>
+            <w:tcBorders>
+              <w:top w:val="single" w:color="D9D4C5" w:sz="4"/>
+              <w:left w:val="single" w:color="D9D4C5" w:sz="4"/>
+              <w:bottom w:val="single" w:color="D9D4C5" w:sz="4"/>
+              <w:right w:val="single" w:color="D9D4C5" w:sz="4"/>
+            </w:tcBorders>
+            <w:tcMar>
+              <w:top w:type="dxa" w:w="70"/>
+              <w:left w:type="dxa" w:w="110"/>
+              <w:bottom w:type="dxa" w:w="70"/>
+              <w:right w:type="dxa" w:w="110"/>
+            </w:tcMar>
+            <w:vAlign w:val="center"/>
+          </w:tcPr>
+          <w:p>
+            <w:pPr>
+              <w:spacing w:after="0" w:before="0"/>
+            </w:pPr>
+            <w:r>
+              <w:rPr>
+                <w:rFonts w:ascii="Arial" w:cs="Arial" w:eastAsia="Arial" w:hAnsi="Arial"/>
+                <w:color w:val="1B2118"/>
+                <w:sz w:val="18"/>
+                <w:szCs w:val="18"/>
+              </w:rPr>
+              <w:t xml:space="preserve">Pseudonimizzazione applicata nel portale (azione A1): Banca Dati Utenze senza nomi e indirizzi.</w:t>
+            </w:r>
+          </w:p>
+        </w:tc>
+        <w:tc>
+          <w:tcPr>
+            <w:tcW w:type="dxa" w:w="2000"/>
+            <w:tcBorders>
+              <w:top w:val="single" w:color="D9D4C5" w:sz="4"/>
+              <w:left w:val="single" w:color="D9D4C5" w:sz="4"/>
+              <w:bottom w:val="single" w:color="D9D4C5" w:sz="4"/>
+              <w:right w:val="single" w:color="D9D4C5" w:sz="4"/>
+            </w:tcBorders>
+            <w:tcMar>
+              <w:top w:type="dxa" w:w="70"/>
+              <w:left w:type="dxa" w:w="110"/>
+              <w:bottom w:type="dxa" w:w="70"/>
+              <w:right w:type="dxa" w:w="110"/>
+            </w:tcMar>
+            <w:vAlign w:val="center"/>
+          </w:tcPr>
+          <w:p>
+            <w:pPr>
+              <w:spacing w:after="0" w:before="0"/>
+            </w:pPr>
+            <w:r>
+              <w:rPr>
+                <w:rFonts w:ascii="Arial" w:cs="Arial" w:eastAsia="Arial" w:hAnsi="Arial"/>
+                <w:color w:val="1B2118"/>
+                <w:sz w:val="18"/>
+                <w:szCs w:val="18"/>
+              </w:rPr>
+              <w:t xml:space="preserve">Fondazione Operate</w:t>
+            </w:r>
+          </w:p>
+        </w:tc>
+      </w:tr>
+      <w:tr>
+        <w:trPr>
+          <w:cantSplit/>
+        </w:trPr>
+        <w:tc>
+          <w:tcPr>
+            <w:tcW w:type="dxa" w:w="800"/>
+            <w:tcBorders>
+              <w:top w:val="single" w:color="D9D4C5" w:sz="4"/>
+              <w:left w:val="single" w:color="D9D4C5" w:sz="4"/>
+              <w:bottom w:val="single" w:color="D9D4C5" w:sz="4"/>
+              <w:right w:val="single" w:color="D9D4C5" w:sz="4"/>
+            </w:tcBorders>
+            <w:shd w:fill="F6F4EE" w:color="auto" w:val="clear"/>
+            <w:tcMar>
+              <w:top w:type="dxa" w:w="70"/>
+              <w:left w:type="dxa" w:w="110"/>
+              <w:bottom w:type="dxa" w:w="70"/>
+              <w:right w:type="dxa" w:w="110"/>
+            </w:tcMar>
+            <w:vAlign w:val="center"/>
+          </w:tcPr>
+          <w:p>
+            <w:pPr>
+              <w:spacing w:after="0" w:before="0"/>
+            </w:pPr>
+            <w:r>
+              <w:rPr>
+                <w:rFonts w:ascii="Arial" w:cs="Arial" w:eastAsia="Arial" w:hAnsi="Arial"/>
+                <w:color w:val="1B2118"/>
+                <w:sz w:val="18"/>
+                <w:szCs w:val="18"/>
+              </w:rPr>
               <w:t xml:space="preserve">1.0</w:t>
             </w:r>
           </w:p>
@@ -732,6 +866,7 @@
               <w:bottom w:val="single" w:color="D9D4C5" w:sz="4"/>
               <w:right w:val="single" w:color="D9D4C5" w:sz="4"/>
             </w:tcBorders>
+            <w:shd w:fill="F6F4EE" w:color="auto" w:val="clear"/>
             <w:tcMar>
               <w:top w:type="dxa" w:w="70"/>
               <w:left w:type="dxa" w:w="110"/>
@@ -764,6 +899,7 @@
               <w:bottom w:val="single" w:color="D9D4C5" w:sz="4"/>
               <w:right w:val="single" w:color="D9D4C5" w:sz="4"/>
             </w:tcBorders>
+            <w:shd w:fill="F6F4EE" w:color="auto" w:val="clear"/>
             <w:tcMar>
               <w:top w:type="dxa" w:w="70"/>
               <w:left w:type="dxa" w:w="110"/>
@@ -796,6 +932,7 @@
               <w:bottom w:val="single" w:color="D9D4C5" w:sz="4"/>
               <w:right w:val="single" w:color="D9D4C5" w:sz="4"/>
             </w:tcBorders>
+            <w:shd w:fill="F6F4EE" w:color="auto" w:val="clear"/>
             <w:tcMar>
               <w:top w:type="dxa" w:w="70"/>
               <w:left w:type="dxa" w:w="110"/>
@@ -837,7 +974,7 @@
           <w:sz w:val="20"/>
           <w:szCs w:val="20"/>
         </w:rPr>
-        <w:t xml:space="preserve">Traccia alla revisione 1.0 del 26/10/2026, preparata dalla Fondazione Operate: descrive il portale; le parti segnate «da completare» spettano al Comune e al suo DPO. Non è un parere legale. Si aggiorna quando cambia il trattamento delle utenze nel portale; la versione corrente (anche in Word, da completare) si scarica dall'area Documentazione del portale (solo Amministratori).</w:t>
+        <w:t xml:space="preserve">Traccia alla revisione 1.1 del 30/10/2026, preparata dalla Fondazione Operate: descrive il portale; le parti segnate «da completare» spettano al Comune e al suo DPO. Non è un parere legale. Si aggiorna quando cambia il trattamento delle utenze nel portale; la versione corrente (anche in Word, da completare) si scarica dall'area Documentazione del portale (solo Amministratori).</w:t>
       </w:r>
     </w:p>
     <w:p>
@@ -4268,9 +4405,9 @@
         <w:tblLayout w:type="fixed"/>
       </w:tblPr>
       <w:tblGrid>
-        <w:gridCol w:w="4931"/>
+        <w:gridCol w:w="4942"/>
         <w:gridCol w:w="1760"/>
-        <w:gridCol w:w="2947"/>
+        <w:gridCol w:w="2936"/>
       </w:tblGrid>
       <w:tr>
         <w:trPr>
@@ -4278,7 +4415,7 @@
         </w:trPr>
         <w:tc>
           <w:tcPr>
-            <w:tcW w:type="dxa" w:w="4931"/>
+            <w:tcW w:type="dxa" w:w="4942"/>
             <w:tcBorders>
               <w:top w:val="single" w:color="D9D4C5" w:sz="4"/>
               <w:left w:val="single" w:color="D9D4C5" w:sz="4"/>
@@ -4348,7 +4485,7 @@
         </w:tc>
         <w:tc>
           <w:tcPr>
-            <w:tcW w:type="dxa" w:w="2947"/>
+            <w:tcW w:type="dxa" w:w="2936"/>
             <w:tcBorders>
               <w:top w:val="single" w:color="D9D4C5" w:sz="4"/>
               <w:left w:val="single" w:color="D9D4C5" w:sz="4"/>
@@ -4388,7 +4525,7 @@
         </w:trPr>
         <w:tc>
           <w:tcPr>
-            <w:tcW w:type="dxa" w:w="4931"/>
+            <w:tcW w:type="dxa" w:w="4942"/>
             <w:tcBorders>
               <w:top w:val="single" w:color="D9D4C5" w:sz="4"/>
               <w:left w:val="single" w:color="D9D4C5" w:sz="4"/>
@@ -4452,7 +4589,7 @@
         </w:tc>
         <w:tc>
           <w:tcPr>
-            <w:tcW w:type="dxa" w:w="2947"/>
+            <w:tcW w:type="dxa" w:w="2936"/>
             <w:tcBorders>
               <w:top w:val="single" w:color="D9D4C5" w:sz="4"/>
               <w:left w:val="single" w:color="D9D4C5" w:sz="4"/>
@@ -4489,7 +4626,7 @@
         </w:trPr>
         <w:tc>
           <w:tcPr>
-            <w:tcW w:type="dxa" w:w="4931"/>
+            <w:tcW w:type="dxa" w:w="4942"/>
             <w:tcBorders>
               <w:top w:val="single" w:color="D9D4C5" w:sz="4"/>
               <w:left w:val="single" w:color="D9D4C5" w:sz="4"/>
@@ -4516,7 +4653,7 @@
                 <w:sz w:val="18"/>
                 <w:szCs w:val="18"/>
               </w:rPr>
-              <w:t xml:space="preserve">Nome del capofamiglia / ragione sociale</w:t>
+              <w:t xml:space="preserve">Categoria tariffaria TARI</w:t>
             </w:r>
           </w:p>
         </w:tc>
@@ -4549,13 +4686,13 @@
                 <w:sz w:val="18"/>
                 <w:szCs w:val="18"/>
               </w:rPr>
-              <w:t xml:space="preserve">Sì</w:t>
-            </w:r>
-          </w:p>
-        </w:tc>
-        <w:tc>
-          <w:tcPr>
-            <w:tcW w:type="dxa" w:w="2947"/>
+              <w:t xml:space="preserve">No</w:t>
+            </w:r>
+          </w:p>
+        </w:tc>
+        <w:tc>
+          <w:tcPr>
+            <w:tcW w:type="dxa" w:w="2936"/>
             <w:tcBorders>
               <w:top w:val="single" w:color="D9D4C5" w:sz="4"/>
               <w:left w:val="single" w:color="D9D4C5" w:sz="4"/>
@@ -4578,13 +4715,11 @@
             <w:r>
               <w:rPr>
                 <w:rFonts w:ascii="Arial" w:cs="Arial" w:eastAsia="Arial" w:hAnsi="Arial"/>
-                <w:b/>
-                <w:bCs/>
-                <w:color w:val="1B2118"/>
-                <w:sz w:val="18"/>
-                <w:szCs w:val="18"/>
-              </w:rPr>
-              <w:t xml:space="preserve">Dato identificativo diretto</w:t>
+                <w:color w:val="1B2118"/>
+                <w:sz w:val="18"/>
+                <w:szCs w:val="18"/>
+              </w:rPr>
+              <w:t xml:space="preserve">Dato tecnico</w:t>
             </w:r>
           </w:p>
         </w:tc>
@@ -4595,33 +4730,33 @@
         </w:trPr>
         <w:tc>
           <w:tcPr>
-            <w:tcW w:type="dxa" w:w="4931"/>
-            <w:tcBorders>
-              <w:top w:val="single" w:color="D9D4C5" w:sz="4"/>
-              <w:left w:val="single" w:color="D9D4C5" w:sz="4"/>
-              <w:bottom w:val="single" w:color="D9D4C5" w:sz="4"/>
-              <w:right w:val="single" w:color="D9D4C5" w:sz="4"/>
-            </w:tcBorders>
-            <w:tcMar>
-              <w:top w:type="dxa" w:w="70"/>
-              <w:left w:type="dxa" w:w="110"/>
-              <w:bottom w:type="dxa" w:w="70"/>
-              <w:right w:type="dxa" w:w="110"/>
-            </w:tcMar>
-            <w:vAlign w:val="center"/>
-          </w:tcPr>
-          <w:p>
-            <w:pPr>
-              <w:spacing w:after="0" w:before="0"/>
-            </w:pPr>
-            <w:r>
-              <w:rPr>
-                <w:rFonts w:ascii="Arial" w:cs="Arial" w:eastAsia="Arial" w:hAnsi="Arial"/>
-                <w:color w:val="1B2118"/>
-                <w:sz w:val="18"/>
-                <w:szCs w:val="18"/>
-              </w:rPr>
-              <w:t xml:space="preserve">Indirizzo (via, civico, interno)</w:t>
+            <w:tcW w:type="dxa" w:w="4942"/>
+            <w:tcBorders>
+              <w:top w:val="single" w:color="D9D4C5" w:sz="4"/>
+              <w:left w:val="single" w:color="D9D4C5" w:sz="4"/>
+              <w:bottom w:val="single" w:color="D9D4C5" w:sz="4"/>
+              <w:right w:val="single" w:color="D9D4C5" w:sz="4"/>
+            </w:tcBorders>
+            <w:tcMar>
+              <w:top w:type="dxa" w:w="70"/>
+              <w:left w:type="dxa" w:w="110"/>
+              <w:bottom w:type="dxa" w:w="70"/>
+              <w:right w:type="dxa" w:w="110"/>
+            </w:tcMar>
+            <w:vAlign w:val="center"/>
+          </w:tcPr>
+          <w:p>
+            <w:pPr>
+              <w:spacing w:after="0" w:before="0"/>
+            </w:pPr>
+            <w:r>
+              <w:rPr>
+                <w:rFonts w:ascii="Arial" w:cs="Arial" w:eastAsia="Arial" w:hAnsi="Arial"/>
+                <w:color w:val="1B2118"/>
+                <w:sz w:val="18"/>
+                <w:szCs w:val="18"/>
+              </w:rPr>
+              <w:t xml:space="preserve">Numero di componenti (solo domestiche)</w:t>
             </w:r>
           </w:p>
         </w:tc>
@@ -4653,41 +4788,39 @@
                 <w:sz w:val="18"/>
                 <w:szCs w:val="18"/>
               </w:rPr>
-              <w:t xml:space="preserve">Sì</w:t>
-            </w:r>
-          </w:p>
-        </w:tc>
-        <w:tc>
-          <w:tcPr>
-            <w:tcW w:type="dxa" w:w="2947"/>
-            <w:tcBorders>
-              <w:top w:val="single" w:color="D9D4C5" w:sz="4"/>
-              <w:left w:val="single" w:color="D9D4C5" w:sz="4"/>
-              <w:bottom w:val="single" w:color="D9D4C5" w:sz="4"/>
-              <w:right w:val="single" w:color="D9D4C5" w:sz="4"/>
-            </w:tcBorders>
-            <w:tcMar>
-              <w:top w:type="dxa" w:w="70"/>
-              <w:left w:type="dxa" w:w="110"/>
-              <w:bottom w:type="dxa" w:w="70"/>
-              <w:right w:type="dxa" w:w="110"/>
-            </w:tcMar>
-            <w:vAlign w:val="center"/>
-          </w:tcPr>
-          <w:p>
-            <w:pPr>
-              <w:spacing w:after="0" w:before="0"/>
-            </w:pPr>
-            <w:r>
-              <w:rPr>
-                <w:rFonts w:ascii="Arial" w:cs="Arial" w:eastAsia="Arial" w:hAnsi="Arial"/>
-                <w:b/>
-                <w:bCs/>
-                <w:color w:val="1B2118"/>
-                <w:sz w:val="18"/>
-                <w:szCs w:val="18"/>
-              </w:rPr>
-              <w:t xml:space="preserve">Dato identificativo diretto</w:t>
+              <w:t xml:space="preserve">No</w:t>
+            </w:r>
+          </w:p>
+        </w:tc>
+        <w:tc>
+          <w:tcPr>
+            <w:tcW w:type="dxa" w:w="2936"/>
+            <w:tcBorders>
+              <w:top w:val="single" w:color="D9D4C5" w:sz="4"/>
+              <w:left w:val="single" w:color="D9D4C5" w:sz="4"/>
+              <w:bottom w:val="single" w:color="D9D4C5" w:sz="4"/>
+              <w:right w:val="single" w:color="D9D4C5" w:sz="4"/>
+            </w:tcBorders>
+            <w:tcMar>
+              <w:top w:type="dxa" w:w="70"/>
+              <w:left w:type="dxa" w:w="110"/>
+              <w:bottom w:type="dxa" w:w="70"/>
+              <w:right w:type="dxa" w:w="110"/>
+            </w:tcMar>
+            <w:vAlign w:val="center"/>
+          </w:tcPr>
+          <w:p>
+            <w:pPr>
+              <w:spacing w:after="0" w:before="0"/>
+            </w:pPr>
+            <w:r>
+              <w:rPr>
+                <w:rFonts w:ascii="Arial" w:cs="Arial" w:eastAsia="Arial" w:hAnsi="Arial"/>
+                <w:color w:val="1B2118"/>
+                <w:sz w:val="18"/>
+                <w:szCs w:val="18"/>
+              </w:rPr>
+              <w:t xml:space="preserve">Dato personale (composizione della famiglia)</w:t>
             </w:r>
           </w:p>
         </w:tc>
@@ -4698,7 +4831,7 @@
         </w:trPr>
         <w:tc>
           <w:tcPr>
-            <w:tcW w:type="dxa" w:w="4931"/>
+            <w:tcW w:type="dxa" w:w="4942"/>
             <w:tcBorders>
               <w:top w:val="single" w:color="D9D4C5" w:sz="4"/>
               <w:left w:val="single" w:color="D9D4C5" w:sz="4"/>
@@ -4725,7 +4858,7 @@
                 <w:sz w:val="18"/>
                 <w:szCs w:val="18"/>
               </w:rPr>
-              <w:t xml:space="preserve">Categoria tariffaria TARI</w:t>
+              <w:t xml:space="preserve">Metri quadrati</w:t>
             </w:r>
           </w:p>
         </w:tc>
@@ -4764,7 +4897,7 @@
         </w:tc>
         <w:tc>
           <w:tcPr>
-            <w:tcW w:type="dxa" w:w="2947"/>
+            <w:tcW w:type="dxa" w:w="2936"/>
             <w:tcBorders>
               <w:top w:val="single" w:color="D9D4C5" w:sz="4"/>
               <w:left w:val="single" w:color="D9D4C5" w:sz="4"/>
@@ -4791,7 +4924,7 @@
                 <w:sz w:val="18"/>
                 <w:szCs w:val="18"/>
               </w:rPr>
-              <w:t xml:space="preserve">Dato tecnico</w:t>
+              <w:t xml:space="preserve">Dato personale</w:t>
             </w:r>
           </w:p>
         </w:tc>
@@ -4802,33 +4935,33 @@
         </w:trPr>
         <w:tc>
           <w:tcPr>
-            <w:tcW w:type="dxa" w:w="4931"/>
-            <w:tcBorders>
-              <w:top w:val="single" w:color="D9D4C5" w:sz="4"/>
-              <w:left w:val="single" w:color="D9D4C5" w:sz="4"/>
-              <w:bottom w:val="single" w:color="D9D4C5" w:sz="4"/>
-              <w:right w:val="single" w:color="D9D4C5" w:sz="4"/>
-            </w:tcBorders>
-            <w:tcMar>
-              <w:top w:type="dxa" w:w="70"/>
-              <w:left w:type="dxa" w:w="110"/>
-              <w:bottom w:type="dxa" w:w="70"/>
-              <w:right w:type="dxa" w:w="110"/>
-            </w:tcMar>
-            <w:vAlign w:val="center"/>
-          </w:tcPr>
-          <w:p>
-            <w:pPr>
-              <w:spacing w:after="0" w:before="0"/>
-            </w:pPr>
-            <w:r>
-              <w:rPr>
-                <w:rFonts w:ascii="Arial" w:cs="Arial" w:eastAsia="Arial" w:hAnsi="Arial"/>
-                <w:color w:val="1B2118"/>
-                <w:sz w:val="18"/>
-                <w:szCs w:val="18"/>
-              </w:rPr>
-              <w:t xml:space="preserve">Numero di componenti (solo domestiche)</w:t>
+            <w:tcW w:type="dxa" w:w="4942"/>
+            <w:tcBorders>
+              <w:top w:val="single" w:color="D9D4C5" w:sz="4"/>
+              <w:left w:val="single" w:color="D9D4C5" w:sz="4"/>
+              <w:bottom w:val="single" w:color="D9D4C5" w:sz="4"/>
+              <w:right w:val="single" w:color="D9D4C5" w:sz="4"/>
+            </w:tcBorders>
+            <w:tcMar>
+              <w:top w:type="dxa" w:w="70"/>
+              <w:left w:type="dxa" w:w="110"/>
+              <w:bottom w:type="dxa" w:w="70"/>
+              <w:right w:type="dxa" w:w="110"/>
+            </w:tcMar>
+            <w:vAlign w:val="center"/>
+          </w:tcPr>
+          <w:p>
+            <w:pPr>
+              <w:spacing w:after="0" w:before="0"/>
+            </w:pPr>
+            <w:r>
+              <w:rPr>
+                <w:rFonts w:ascii="Arial" w:cs="Arial" w:eastAsia="Arial" w:hAnsi="Arial"/>
+                <w:color w:val="1B2118"/>
+                <w:sz w:val="18"/>
+                <w:szCs w:val="18"/>
+              </w:rPr>
+              <w:t xml:space="preserve">Produzione totale di rifiuti (kg/anno)</w:t>
             </w:r>
           </w:p>
         </w:tc>
@@ -4860,39 +4993,39 @@
                 <w:sz w:val="18"/>
                 <w:szCs w:val="18"/>
               </w:rPr>
-              <w:t xml:space="preserve">No</w:t>
-            </w:r>
-          </w:p>
-        </w:tc>
-        <w:tc>
-          <w:tcPr>
-            <w:tcW w:type="dxa" w:w="2947"/>
-            <w:tcBorders>
-              <w:top w:val="single" w:color="D9D4C5" w:sz="4"/>
-              <w:left w:val="single" w:color="D9D4C5" w:sz="4"/>
-              <w:bottom w:val="single" w:color="D9D4C5" w:sz="4"/>
-              <w:right w:val="single" w:color="D9D4C5" w:sz="4"/>
-            </w:tcBorders>
-            <w:tcMar>
-              <w:top w:type="dxa" w:w="70"/>
-              <w:left w:type="dxa" w:w="110"/>
-              <w:bottom w:type="dxa" w:w="70"/>
-              <w:right w:type="dxa" w:w="110"/>
-            </w:tcMar>
-            <w:vAlign w:val="center"/>
-          </w:tcPr>
-          <w:p>
-            <w:pPr>
-              <w:spacing w:after="0" w:before="0"/>
-            </w:pPr>
-            <w:r>
-              <w:rPr>
-                <w:rFonts w:ascii="Arial" w:cs="Arial" w:eastAsia="Arial" w:hAnsi="Arial"/>
-                <w:color w:val="1B2118"/>
-                <w:sz w:val="18"/>
-                <w:szCs w:val="18"/>
-              </w:rPr>
-              <w:t xml:space="preserve">Dato personale (composizione della famiglia)</w:t>
+              <w:t xml:space="preserve">Sì</w:t>
+            </w:r>
+          </w:p>
+        </w:tc>
+        <w:tc>
+          <w:tcPr>
+            <w:tcW w:type="dxa" w:w="2936"/>
+            <w:tcBorders>
+              <w:top w:val="single" w:color="D9D4C5" w:sz="4"/>
+              <w:left w:val="single" w:color="D9D4C5" w:sz="4"/>
+              <w:bottom w:val="single" w:color="D9D4C5" w:sz="4"/>
+              <w:right w:val="single" w:color="D9D4C5" w:sz="4"/>
+            </w:tcBorders>
+            <w:tcMar>
+              <w:top w:type="dxa" w:w="70"/>
+              <w:left w:type="dxa" w:w="110"/>
+              <w:bottom w:type="dxa" w:w="70"/>
+              <w:right w:type="dxa" w:w="110"/>
+            </w:tcMar>
+            <w:vAlign w:val="center"/>
+          </w:tcPr>
+          <w:p>
+            <w:pPr>
+              <w:spacing w:after="0" w:before="0"/>
+            </w:pPr>
+            <w:r>
+              <w:rPr>
+                <w:rFonts w:ascii="Arial" w:cs="Arial" w:eastAsia="Arial" w:hAnsi="Arial"/>
+                <w:color w:val="1B2118"/>
+                <w:sz w:val="18"/>
+                <w:szCs w:val="18"/>
+              </w:rPr>
+              <w:t xml:space="preserve">Dato personale (comportamento)</w:t>
             </w:r>
           </w:p>
         </w:tc>
@@ -4903,7 +5036,7 @@
         </w:trPr>
         <w:tc>
           <w:tcPr>
-            <w:tcW w:type="dxa" w:w="4931"/>
+            <w:tcW w:type="dxa" w:w="4942"/>
             <w:tcBorders>
               <w:top w:val="single" w:color="D9D4C5" w:sz="4"/>
               <w:left w:val="single" w:color="D9D4C5" w:sz="4"/>
@@ -4930,7 +5063,7 @@
                 <w:sz w:val="18"/>
                 <w:szCs w:val="18"/>
               </w:rPr>
-              <w:t xml:space="preserve">Metri quadrati</w:t>
+              <w:t xml:space="preserve">Kg per frazione (indifferenziato obbligatorio; organico, carta, plastica, vetro…)</w:t>
             </w:r>
           </w:p>
         </w:tc>
@@ -4963,13 +5096,13 @@
                 <w:sz w:val="18"/>
                 <w:szCs w:val="18"/>
               </w:rPr>
-              <w:t xml:space="preserve">No</w:t>
-            </w:r>
-          </w:p>
-        </w:tc>
-        <w:tc>
-          <w:tcPr>
-            <w:tcW w:type="dxa" w:w="2947"/>
+              <w:t xml:space="preserve">In parte</w:t>
+            </w:r>
+          </w:p>
+        </w:tc>
+        <w:tc>
+          <w:tcPr>
+            <w:tcW w:type="dxa" w:w="2936"/>
             <w:tcBorders>
               <w:top w:val="single" w:color="D9D4C5" w:sz="4"/>
               <w:left w:val="single" w:color="D9D4C5" w:sz="4"/>
@@ -4996,7 +5129,7 @@
                 <w:sz w:val="18"/>
                 <w:szCs w:val="18"/>
               </w:rPr>
-              <w:t xml:space="preserve">Dato personale</w:t>
+              <w:t xml:space="preserve">Dato personale (comportamento)</w:t>
             </w:r>
           </w:p>
         </w:tc>
@@ -5007,33 +5140,33 @@
         </w:trPr>
         <w:tc>
           <w:tcPr>
-            <w:tcW w:type="dxa" w:w="4931"/>
-            <w:tcBorders>
-              <w:top w:val="single" w:color="D9D4C5" w:sz="4"/>
-              <w:left w:val="single" w:color="D9D4C5" w:sz="4"/>
-              <w:bottom w:val="single" w:color="D9D4C5" w:sz="4"/>
-              <w:right w:val="single" w:color="D9D4C5" w:sz="4"/>
-            </w:tcBorders>
-            <w:tcMar>
-              <w:top w:type="dxa" w:w="70"/>
-              <w:left w:type="dxa" w:w="110"/>
-              <w:bottom w:type="dxa" w:w="70"/>
-              <w:right w:type="dxa" w:w="110"/>
-            </w:tcMar>
-            <w:vAlign w:val="center"/>
-          </w:tcPr>
-          <w:p>
-            <w:pPr>
-              <w:spacing w:after="0" w:before="0"/>
-            </w:pPr>
-            <w:r>
-              <w:rPr>
-                <w:rFonts w:ascii="Arial" w:cs="Arial" w:eastAsia="Arial" w:hAnsi="Arial"/>
-                <w:color w:val="1B2118"/>
-                <w:sz w:val="18"/>
-                <w:szCs w:val="18"/>
-              </w:rPr>
-              <w:t xml:space="preserve">Produzione totale di rifiuti (kg/anno)</w:t>
+            <w:tcW w:type="dxa" w:w="4942"/>
+            <w:tcBorders>
+              <w:top w:val="single" w:color="D9D4C5" w:sz="4"/>
+              <w:left w:val="single" w:color="D9D4C5" w:sz="4"/>
+              <w:bottom w:val="single" w:color="D9D4C5" w:sz="4"/>
+              <w:right w:val="single" w:color="D9D4C5" w:sz="4"/>
+            </w:tcBorders>
+            <w:tcMar>
+              <w:top w:type="dxa" w:w="70"/>
+              <w:left w:type="dxa" w:w="110"/>
+              <w:bottom w:type="dxa" w:w="70"/>
+              <w:right w:type="dxa" w:w="110"/>
+            </w:tcMar>
+            <w:vAlign w:val="center"/>
+          </w:tcPr>
+          <w:p>
+            <w:pPr>
+              <w:spacing w:after="0" w:before="0"/>
+            </w:pPr>
+            <w:r>
+              <w:rPr>
+                <w:rFonts w:ascii="Arial" w:cs="Arial" w:eastAsia="Arial" w:hAnsi="Arial"/>
+                <w:color w:val="1B2118"/>
+                <w:sz w:val="18"/>
+                <w:szCs w:val="18"/>
+              </w:rPr>
+              <w:t xml:space="preserve">Numero di svuotamenti per frazione</w:t>
             </w:r>
           </w:p>
         </w:tc>
@@ -5065,218 +5198,13 @@
                 <w:sz w:val="18"/>
                 <w:szCs w:val="18"/>
               </w:rPr>
-              <w:t xml:space="preserve">Sì</w:t>
-            </w:r>
-          </w:p>
-        </w:tc>
-        <w:tc>
-          <w:tcPr>
-            <w:tcW w:type="dxa" w:w="2947"/>
-            <w:tcBorders>
-              <w:top w:val="single" w:color="D9D4C5" w:sz="4"/>
-              <w:left w:val="single" w:color="D9D4C5" w:sz="4"/>
-              <w:bottom w:val="single" w:color="D9D4C5" w:sz="4"/>
-              <w:right w:val="single" w:color="D9D4C5" w:sz="4"/>
-            </w:tcBorders>
-            <w:tcMar>
-              <w:top w:type="dxa" w:w="70"/>
-              <w:left w:type="dxa" w:w="110"/>
-              <w:bottom w:type="dxa" w:w="70"/>
-              <w:right w:type="dxa" w:w="110"/>
-            </w:tcMar>
-            <w:vAlign w:val="center"/>
-          </w:tcPr>
-          <w:p>
-            <w:pPr>
-              <w:spacing w:after="0" w:before="0"/>
-            </w:pPr>
-            <w:r>
-              <w:rPr>
-                <w:rFonts w:ascii="Arial" w:cs="Arial" w:eastAsia="Arial" w:hAnsi="Arial"/>
-                <w:color w:val="1B2118"/>
-                <w:sz w:val="18"/>
-                <w:szCs w:val="18"/>
-              </w:rPr>
-              <w:t xml:space="preserve">Dato personale (comportamento)</w:t>
-            </w:r>
-          </w:p>
-        </w:tc>
-      </w:tr>
-      <w:tr>
-        <w:trPr>
-          <w:cantSplit/>
-        </w:trPr>
-        <w:tc>
-          <w:tcPr>
-            <w:tcW w:type="dxa" w:w="4931"/>
-            <w:tcBorders>
-              <w:top w:val="single" w:color="D9D4C5" w:sz="4"/>
-              <w:left w:val="single" w:color="D9D4C5" w:sz="4"/>
-              <w:bottom w:val="single" w:color="D9D4C5" w:sz="4"/>
-              <w:right w:val="single" w:color="D9D4C5" w:sz="4"/>
-            </w:tcBorders>
-            <w:shd w:fill="F6F4EE" w:color="auto" w:val="clear"/>
-            <w:tcMar>
-              <w:top w:type="dxa" w:w="70"/>
-              <w:left w:type="dxa" w:w="110"/>
-              <w:bottom w:type="dxa" w:w="70"/>
-              <w:right w:type="dxa" w:w="110"/>
-            </w:tcMar>
-            <w:vAlign w:val="center"/>
-          </w:tcPr>
-          <w:p>
-            <w:pPr>
-              <w:spacing w:after="0" w:before="0"/>
-            </w:pPr>
-            <w:r>
-              <w:rPr>
-                <w:rFonts w:ascii="Arial" w:cs="Arial" w:eastAsia="Arial" w:hAnsi="Arial"/>
-                <w:color w:val="1B2118"/>
-                <w:sz w:val="18"/>
-                <w:szCs w:val="18"/>
-              </w:rPr>
-              <w:t xml:space="preserve">Kg per frazione (indifferenziato obbligatorio; organico, carta, plastica, vetro…)</w:t>
-            </w:r>
-          </w:p>
-        </w:tc>
-        <w:tc>
-          <w:tcPr>
-            <w:tcW w:type="dxa" w:w="1760"/>
-            <w:tcBorders>
-              <w:top w:val="single" w:color="D9D4C5" w:sz="4"/>
-              <w:left w:val="single" w:color="D9D4C5" w:sz="4"/>
-              <w:bottom w:val="single" w:color="D9D4C5" w:sz="4"/>
-              <w:right w:val="single" w:color="D9D4C5" w:sz="4"/>
-            </w:tcBorders>
-            <w:shd w:fill="F6F4EE" w:color="auto" w:val="clear"/>
-            <w:tcMar>
-              <w:top w:type="dxa" w:w="70"/>
-              <w:left w:type="dxa" w:w="110"/>
-              <w:bottom w:type="dxa" w:w="70"/>
-              <w:right w:type="dxa" w:w="110"/>
-            </w:tcMar>
-            <w:vAlign w:val="center"/>
-          </w:tcPr>
-          <w:p>
-            <w:pPr>
-              <w:spacing w:after="0" w:before="0"/>
-            </w:pPr>
-            <w:r>
-              <w:rPr>
-                <w:rFonts w:ascii="Arial" w:cs="Arial" w:eastAsia="Arial" w:hAnsi="Arial"/>
-                <w:color w:val="1B2118"/>
-                <w:sz w:val="18"/>
-                <w:szCs w:val="18"/>
-              </w:rPr>
-              <w:t xml:space="preserve">In parte</w:t>
-            </w:r>
-          </w:p>
-        </w:tc>
-        <w:tc>
-          <w:tcPr>
-            <w:tcW w:type="dxa" w:w="2947"/>
-            <w:tcBorders>
-              <w:top w:val="single" w:color="D9D4C5" w:sz="4"/>
-              <w:left w:val="single" w:color="D9D4C5" w:sz="4"/>
-              <w:bottom w:val="single" w:color="D9D4C5" w:sz="4"/>
-              <w:right w:val="single" w:color="D9D4C5" w:sz="4"/>
-            </w:tcBorders>
-            <w:shd w:fill="F6F4EE" w:color="auto" w:val="clear"/>
-            <w:tcMar>
-              <w:top w:type="dxa" w:w="70"/>
-              <w:left w:type="dxa" w:w="110"/>
-              <w:bottom w:type="dxa" w:w="70"/>
-              <w:right w:type="dxa" w:w="110"/>
-            </w:tcMar>
-            <w:vAlign w:val="center"/>
-          </w:tcPr>
-          <w:p>
-            <w:pPr>
-              <w:spacing w:after="0" w:before="0"/>
-            </w:pPr>
-            <w:r>
-              <w:rPr>
-                <w:rFonts w:ascii="Arial" w:cs="Arial" w:eastAsia="Arial" w:hAnsi="Arial"/>
-                <w:color w:val="1B2118"/>
-                <w:sz w:val="18"/>
-                <w:szCs w:val="18"/>
-              </w:rPr>
-              <w:t xml:space="preserve">Dato personale (comportamento)</w:t>
-            </w:r>
-          </w:p>
-        </w:tc>
-      </w:tr>
-      <w:tr>
-        <w:trPr>
-          <w:cantSplit/>
-        </w:trPr>
-        <w:tc>
-          <w:tcPr>
-            <w:tcW w:type="dxa" w:w="4931"/>
-            <w:tcBorders>
-              <w:top w:val="single" w:color="D9D4C5" w:sz="4"/>
-              <w:left w:val="single" w:color="D9D4C5" w:sz="4"/>
-              <w:bottom w:val="single" w:color="D9D4C5" w:sz="4"/>
-              <w:right w:val="single" w:color="D9D4C5" w:sz="4"/>
-            </w:tcBorders>
-            <w:tcMar>
-              <w:top w:type="dxa" w:w="70"/>
-              <w:left w:type="dxa" w:w="110"/>
-              <w:bottom w:type="dxa" w:w="70"/>
-              <w:right w:type="dxa" w:w="110"/>
-            </w:tcMar>
-            <w:vAlign w:val="center"/>
-          </w:tcPr>
-          <w:p>
-            <w:pPr>
-              <w:spacing w:after="0" w:before="0"/>
-            </w:pPr>
-            <w:r>
-              <w:rPr>
-                <w:rFonts w:ascii="Arial" w:cs="Arial" w:eastAsia="Arial" w:hAnsi="Arial"/>
-                <w:color w:val="1B2118"/>
-                <w:sz w:val="18"/>
-                <w:szCs w:val="18"/>
-              </w:rPr>
-              <w:t xml:space="preserve">Numero di svuotamenti per frazione</w:t>
-            </w:r>
-          </w:p>
-        </w:tc>
-        <w:tc>
-          <w:tcPr>
-            <w:tcW w:type="dxa" w:w="1760"/>
-            <w:tcBorders>
-              <w:top w:val="single" w:color="D9D4C5" w:sz="4"/>
-              <w:left w:val="single" w:color="D9D4C5" w:sz="4"/>
-              <w:bottom w:val="single" w:color="D9D4C5" w:sz="4"/>
-              <w:right w:val="single" w:color="D9D4C5" w:sz="4"/>
-            </w:tcBorders>
-            <w:tcMar>
-              <w:top w:type="dxa" w:w="70"/>
-              <w:left w:type="dxa" w:w="110"/>
-              <w:bottom w:type="dxa" w:w="70"/>
-              <w:right w:type="dxa" w:w="110"/>
-            </w:tcMar>
-            <w:vAlign w:val="center"/>
-          </w:tcPr>
-          <w:p>
-            <w:pPr>
-              <w:spacing w:after="0" w:before="0"/>
-            </w:pPr>
-            <w:r>
-              <w:rPr>
-                <w:rFonts w:ascii="Arial" w:cs="Arial" w:eastAsia="Arial" w:hAnsi="Arial"/>
-                <w:color w:val="1B2118"/>
-                <w:sz w:val="18"/>
-                <w:szCs w:val="18"/>
-              </w:rPr>
               <w:t xml:space="preserve">No</w:t>
             </w:r>
           </w:p>
         </w:tc>
         <w:tc>
           <w:tcPr>
-            <w:tcW w:type="dxa" w:w="2947"/>
+            <w:tcW w:type="dxa" w:w="2936"/>
             <w:tcBorders>
               <w:top w:val="single" w:color="D9D4C5" w:sz="4"/>
               <w:left w:val="single" w:color="D9D4C5" w:sz="4"/>
@@ -5335,7 +5263,7 @@
           <w:sz w:val="21"/>
           <w:szCs w:val="21"/>
         </w:rPr>
-        <w:t xml:space="preserve"> codice fiscale, data di nascita, telefono, email, dati di pagamento, situazione economica, riduzioni o agevolazioni (che potrebbero rivelare condizioni di salute o di disagio).</w:t>
+        <w:t xml:space="preserve"> nome del capofamiglia o ragione sociale e indirizzo (dal 30/10/2026: il portale non li chiede e, se un file li contiene, li ignora), codice fiscale, data di nascita, telefono, email, dati di pagamento, situazione economica, riduzioni o agevolazioni (che potrebbero rivelare condizioni di salute o di disagio).</w:t>
       </w:r>
     </w:p>
     <w:p>
@@ -5419,7 +5347,7 @@
           <w:sz w:val="21"/>
           <w:szCs w:val="21"/>
         </w:rPr>
-        <w:t xml:space="preserve">: basta il codice dell'utenza. Il portale li contiene oggi perché il modello è stato pensato così (scelta del 22/10/2026). La Fondazione propone di valutare la </w:t>
+        <w:t xml:space="preserve">: basta il codice dell'utenza. Dal 30/10/2026 il portale applica la </w:t>
       </w:r>
       <w:r>
         <w:rPr>
@@ -5439,7 +5367,7 @@
           <w:sz w:val="21"/>
           <w:szCs w:val="21"/>
         </w:rPr>
-        <w:t xml:space="preserve"> (capitolo «Necessità e proporzionalità»): se il Comune manda solo i codici e tiene per sé la corrispondenza codice-nome, la maggior parte dei rischi descritti più avanti si riduce molto.</w:t>
+        <w:t xml:space="preserve"> (capitolo «Necessità e proporzionalità», Proposta 1): il modello non ha più nomi e indirizzi, il Comune manda solo i codici e tiene per sé la corrispondenza codice-intestatario. Così la maggior parte dei rischi descritti più avanti si riduce molto.</w:t>
       </w:r>
     </w:p>
     <w:p>
@@ -9355,8 +9283,8 @@
       </w:tblPr>
       <w:tblGrid>
         <w:gridCol w:w="2010"/>
-        <w:gridCol w:w="4362"/>
-        <w:gridCol w:w="3266"/>
+        <w:gridCol w:w="4592"/>
+        <w:gridCol w:w="3036"/>
       </w:tblGrid>
       <w:tr>
         <w:trPr>
@@ -9399,7 +9327,7 @@
         </w:tc>
         <w:tc>
           <w:tcPr>
-            <w:tcW w:type="dxa" w:w="4362"/>
+            <w:tcW w:type="dxa" w:w="4592"/>
             <w:tcBorders>
               <w:top w:val="single" w:color="D9D4C5" w:sz="4"/>
               <w:left w:val="single" w:color="D9D4C5" w:sz="4"/>
@@ -9434,7 +9362,7 @@
         </w:tc>
         <w:tc>
           <w:tcPr>
-            <w:tcW w:type="dxa" w:w="3266"/>
+            <w:tcW w:type="dxa" w:w="3036"/>
             <w:tcBorders>
               <w:top w:val="single" w:color="D9D4C5" w:sz="4"/>
               <w:left w:val="single" w:color="D9D4C5" w:sz="4"/>
@@ -9508,7 +9436,7 @@
         </w:tc>
         <w:tc>
           <w:tcPr>
-            <w:tcW w:type="dxa" w:w="4362"/>
+            <w:tcW w:type="dxa" w:w="4592"/>
             <w:tcBorders>
               <w:top w:val="single" w:color="D9D4C5" w:sz="4"/>
               <w:left w:val="single" w:color="D9D4C5" w:sz="4"/>
@@ -9547,48 +9475,46 @@
               </w:rPr>
               <w:t xml:space="preserve">Nome e indirizzo non sono necessari al calcolo</w:t>
             </w:r>
-          </w:p>
-        </w:tc>
-        <w:tc>
-          <w:tcPr>
-            <w:tcW w:type="dxa" w:w="3266"/>
-            <w:tcBorders>
-              <w:top w:val="single" w:color="D9D4C5" w:sz="4"/>
-              <w:left w:val="single" w:color="D9D4C5" w:sz="4"/>
-              <w:bottom w:val="single" w:color="D9D4C5" w:sz="4"/>
-              <w:right w:val="single" w:color="D9D4C5" w:sz="4"/>
-            </w:tcBorders>
-            <w:tcMar>
-              <w:top w:type="dxa" w:w="70"/>
-              <w:left w:type="dxa" w:w="110"/>
-              <w:bottom w:type="dxa" w:w="70"/>
-              <w:right w:type="dxa" w:w="110"/>
-            </w:tcMar>
-            <w:vAlign w:val="center"/>
-          </w:tcPr>
-          <w:p>
-            <w:pPr>
-              <w:spacing w:after="0" w:before="0"/>
-            </w:pPr>
-            <w:r>
-              <w:rPr>
-                <w:rFonts w:ascii="Arial" w:cs="Arial" w:eastAsia="Arial" w:hAnsi="Arial"/>
-                <w:b/>
-                <w:bCs/>
-                <w:color w:val="1B2118"/>
-                <w:sz w:val="18"/>
-                <w:szCs w:val="18"/>
-              </w:rPr>
-              <w:t xml:space="preserve">Da migliorare</w:t>
-            </w:r>
-            <w:r>
-              <w:rPr>
-                <w:rFonts w:ascii="Arial" w:cs="Arial" w:eastAsia="Arial" w:hAnsi="Arial"/>
-                <w:color w:val="1B2118"/>
-                <w:sz w:val="18"/>
-                <w:szCs w:val="18"/>
-              </w:rPr>
-              <w:t xml:space="preserve">: vedi proposta di pseudonimizzazione qui sotto</w:t>
+            <w:r>
+              <w:rPr>
+                <w:rFonts w:ascii="Arial" w:cs="Arial" w:eastAsia="Arial" w:hAnsi="Arial"/>
+                <w:color w:val="1B2118"/>
+                <w:sz w:val="18"/>
+                <w:szCs w:val="18"/>
+              </w:rPr>
+              <w:t xml:space="preserve"> e dal 30/10/2026 il portale non li tratta</w:t>
+            </w:r>
+          </w:p>
+        </w:tc>
+        <w:tc>
+          <w:tcPr>
+            <w:tcW w:type="dxa" w:w="3036"/>
+            <w:tcBorders>
+              <w:top w:val="single" w:color="D9D4C5" w:sz="4"/>
+              <w:left w:val="single" w:color="D9D4C5" w:sz="4"/>
+              <w:bottom w:val="single" w:color="D9D4C5" w:sz="4"/>
+              <w:right w:val="single" w:color="D9D4C5" w:sz="4"/>
+            </w:tcBorders>
+            <w:tcMar>
+              <w:top w:type="dxa" w:w="70"/>
+              <w:left w:type="dxa" w:w="110"/>
+              <w:bottom w:type="dxa" w:w="70"/>
+              <w:right w:type="dxa" w:w="110"/>
+            </w:tcMar>
+            <w:vAlign w:val="center"/>
+          </w:tcPr>
+          <w:p>
+            <w:pPr>
+              <w:spacing w:after="0" w:before="0"/>
+            </w:pPr>
+            <w:r>
+              <w:rPr>
+                <w:rFonts w:ascii="Arial" w:cs="Arial" w:eastAsia="Arial" w:hAnsi="Arial"/>
+                <w:color w:val="1B2118"/>
+                <w:sz w:val="18"/>
+                <w:szCs w:val="18"/>
+              </w:rPr>
+              <w:t xml:space="preserve">Adeguato (pseudonimizzazione applicata, Proposta 1)</w:t>
             </w:r>
           </w:p>
         </w:tc>
@@ -9634,7 +9560,7 @@
         </w:tc>
         <w:tc>
           <w:tcPr>
-            <w:tcW w:type="dxa" w:w="4362"/>
+            <w:tcW w:type="dxa" w:w="4592"/>
             <w:tcBorders>
               <w:top w:val="single" w:color="D9D4C5" w:sz="4"/>
               <w:left w:val="single" w:color="D9D4C5" w:sz="4"/>
@@ -9667,7 +9593,7 @@
         </w:tc>
         <w:tc>
           <w:tcPr>
-            <w:tcW w:type="dxa" w:w="3266"/>
+            <w:tcW w:type="dxa" w:w="3036"/>
             <w:tcBorders>
               <w:top w:val="single" w:color="D9D4C5" w:sz="4"/>
               <w:left w:val="single" w:color="D9D4C5" w:sz="4"/>
@@ -9739,7 +9665,7 @@
         </w:tc>
         <w:tc>
           <w:tcPr>
-            <w:tcW w:type="dxa" w:w="4362"/>
+            <w:tcW w:type="dxa" w:w="4592"/>
             <w:tcBorders>
               <w:top w:val="single" w:color="D9D4C5" w:sz="4"/>
               <w:left w:val="single" w:color="D9D4C5" w:sz="4"/>
@@ -9771,7 +9697,7 @@
         </w:tc>
         <w:tc>
           <w:tcPr>
-            <w:tcW w:type="dxa" w:w="3266"/>
+            <w:tcW w:type="dxa" w:w="3036"/>
             <w:tcBorders>
               <w:top w:val="single" w:color="D9D4C5" w:sz="4"/>
               <w:left w:val="single" w:color="D9D4C5" w:sz="4"/>
@@ -9843,7 +9769,7 @@
         </w:tc>
         <w:tc>
           <w:tcPr>
-            <w:tcW w:type="dxa" w:w="4362"/>
+            <w:tcW w:type="dxa" w:w="4592"/>
             <w:tcBorders>
               <w:top w:val="single" w:color="D9D4C5" w:sz="4"/>
               <w:left w:val="single" w:color="D9D4C5" w:sz="4"/>
@@ -9876,7 +9802,7 @@
         </w:tc>
         <w:tc>
           <w:tcPr>
-            <w:tcW w:type="dxa" w:w="3266"/>
+            <w:tcW w:type="dxa" w:w="3036"/>
             <w:tcBorders>
               <w:top w:val="single" w:color="D9D4C5" w:sz="4"/>
               <w:left w:val="single" w:color="D9D4C5" w:sz="4"/>
@@ -9959,7 +9885,7 @@
         </w:tc>
         <w:tc>
           <w:tcPr>
-            <w:tcW w:type="dxa" w:w="4362"/>
+            <w:tcW w:type="dxa" w:w="4592"/>
             <w:tcBorders>
               <w:top w:val="single" w:color="D9D4C5" w:sz="4"/>
               <w:left w:val="single" w:color="D9D4C5" w:sz="4"/>
@@ -9991,7 +9917,7 @@
         </w:tc>
         <w:tc>
           <w:tcPr>
-            <w:tcW w:type="dxa" w:w="3266"/>
+            <w:tcW w:type="dxa" w:w="3036"/>
             <w:tcBorders>
               <w:top w:val="single" w:color="D9D4C5" w:sz="4"/>
               <w:left w:val="single" w:color="D9D4C5" w:sz="4"/>
@@ -10063,7 +9989,7 @@
         </w:tc>
         <w:tc>
           <w:tcPr>
-            <w:tcW w:type="dxa" w:w="4362"/>
+            <w:tcW w:type="dxa" w:w="4592"/>
             <w:tcBorders>
               <w:top w:val="single" w:color="D9D4C5" w:sz="4"/>
               <w:left w:val="single" w:color="D9D4C5" w:sz="4"/>
@@ -10096,7 +10022,7 @@
         </w:tc>
         <w:tc>
           <w:tcPr>
-            <w:tcW w:type="dxa" w:w="3266"/>
+            <w:tcW w:type="dxa" w:w="3036"/>
             <w:tcBorders>
               <w:top w:val="single" w:color="D9D4C5" w:sz="4"/>
               <w:left w:val="single" w:color="D9D4C5" w:sz="4"/>
@@ -10176,7 +10102,27 @@
           <w:sz w:val="21"/>
           <w:szCs w:val="21"/>
         </w:rPr>
-        <w:t xml:space="preserve"> (o un codice creato apposta, diverso dal codice TARI) e tiene presso di sé la tabella di corrispondenza con nomi e indirizzi. Nel portale le colonne «Nome» e «Indirizzo» diventano facoltative o spariscono. Effetti:</w:t>
+        <w:t xml:space="preserve"> (o un codice creato apposta, diverso dal codice TARI) e tiene presso di sé la tabella di corrispondenza con nomi e indirizzi. </w:t>
+      </w:r>
+      <w:r>
+        <w:rPr>
+          <w:rFonts w:ascii="Arial" w:cs="Arial" w:eastAsia="Arial" w:hAnsi="Arial"/>
+          <w:b/>
+          <w:bCs/>
+          <w:color w:val="1B2118"/>
+          <w:sz w:val="21"/>
+          <w:szCs w:val="21"/>
+        </w:rPr>
+        <w:t xml:space="preserve">Applicata nel portale dal 30/10/2026</w:t>
+      </w:r>
+      <w:r>
+        <w:rPr>
+          <w:rFonts w:ascii="Arial" w:cs="Arial" w:eastAsia="Arial" w:hAnsi="Arial"/>
+          <w:color w:val="1B2118"/>
+          <w:sz w:val="21"/>
+          <w:szCs w:val="21"/>
+        </w:rPr>
+        <w:t xml:space="preserve"> (rilievo T29 del collaudo, scelta di Luca Moretti): il modello «Banca dati utenze CWP» non ha più le colonne «Nome» e «Indirizzo», il portale ignora quelle colonne nei file vecchi e non le salva. Effetti:</w:t>
       </w:r>
     </w:p>
     <w:p>
@@ -10267,7 +10213,7 @@
           <w:sz w:val="21"/>
           <w:szCs w:val="21"/>
         </w:rPr>
-        <w:t xml:space="preserve">La modifica del portale è piccola e la Fondazione può farla prima dell'arrivo dei dati reali. </w:t>
+        <w:t xml:space="preserve">Resta al Comune scegliere se usare il codice TARI o un codice creato apposta. </w:t>
       </w:r>
       <w:r>
         <w:rPr>
@@ -10278,7 +10224,7 @@
           <w:sz w:val="21"/>
           <w:szCs w:val="21"/>
         </w:rPr>
-        <w:t xml:space="preserve">[decisione del Comune e della Fondazione: ……………………]</w:t>
+        <w:t xml:space="preserve">[scelta del Comune: ……………………]</w:t>
       </w:r>
     </w:p>
     <w:p>
@@ -10494,27 +10440,7 @@
           <w:sz w:val="21"/>
           <w:szCs w:val="21"/>
         </w:rPr>
-        <w:t xml:space="preserve"> nel portale e </w:t>
-      </w:r>
-      <w:r>
-        <w:rPr>
-          <w:rFonts w:ascii="Arial" w:cs="Arial" w:eastAsia="Arial" w:hAnsi="Arial"/>
-          <w:b/>
-          <w:bCs/>
-          <w:color w:val="1B2118"/>
-          <w:sz w:val="21"/>
-          <w:szCs w:val="21"/>
-        </w:rPr>
-        <w:t xml:space="preserve">senza</w:t>
-      </w:r>
-      <w:r>
-        <w:rPr>
-          <w:rFonts w:ascii="Arial" w:cs="Arial" w:eastAsia="Arial" w:hAnsi="Arial"/>
-          <w:color w:val="1B2118"/>
-          <w:sz w:val="21"/>
-          <w:szCs w:val="21"/>
-        </w:rPr>
-        <w:t xml:space="preserve"> pseudonimizzazione; la colonna a destra indica il livello dopo il piano d'azione.</w:t>
+        <w:t xml:space="preserve"> nel portale; la colonna «Livello» è stata stimata prima della pseudonimizzazione (applicata dal 30/10/2026, azione A1), quindi è prudente; la colonna a destra indica il livello dopo il piano d'azione.</w:t>
       </w:r>
     </w:p>
     <w:tbl>
@@ -13923,11 +13849,11 @@
         <w:tblLayout w:type="fixed"/>
       </w:tblPr>
       <w:tblGrid>
-        <w:gridCol w:w="908"/>
-        <w:gridCol w:w="4950"/>
+        <w:gridCol w:w="869"/>
+        <w:gridCol w:w="4739"/>
         <w:gridCol w:w="1010"/>
         <w:gridCol w:w="1510"/>
-        <w:gridCol w:w="1260"/>
+        <w:gridCol w:w="1510"/>
       </w:tblGrid>
       <w:tr>
         <w:trPr>
@@ -13935,7 +13861,7 @@
         </w:trPr>
         <w:tc>
           <w:tcPr>
-            <w:tcW w:type="dxa" w:w="908"/>
+            <w:tcW w:type="dxa" w:w="869"/>
             <w:tcBorders>
               <w:top w:val="single" w:color="D9D4C5" w:sz="4"/>
               <w:left w:val="single" w:color="D9D4C5" w:sz="4"/>
@@ -13970,7 +13896,7 @@
         </w:tc>
         <w:tc>
           <w:tcPr>
-            <w:tcW w:type="dxa" w:w="4950"/>
+            <w:tcW w:type="dxa" w:w="4739"/>
             <w:tcBorders>
               <w:top w:val="single" w:color="D9D4C5" w:sz="4"/>
               <w:left w:val="single" w:color="D9D4C5" w:sz="4"/>
@@ -14075,7 +14001,7 @@
         </w:tc>
         <w:tc>
           <w:tcPr>
-            <w:tcW w:type="dxa" w:w="1260"/>
+            <w:tcW w:type="dxa" w:w="1510"/>
             <w:tcBorders>
               <w:top w:val="single" w:color="D9D4C5" w:sz="4"/>
               <w:left w:val="single" w:color="D9D4C5" w:sz="4"/>
@@ -14115,7 +14041,7 @@
         </w:trPr>
         <w:tc>
           <w:tcPr>
-            <w:tcW w:type="dxa" w:w="908"/>
+            <w:tcW w:type="dxa" w:w="869"/>
             <w:tcBorders>
               <w:top w:val="single" w:color="D9D4C5" w:sz="4"/>
               <w:left w:val="single" w:color="D9D4C5" w:sz="4"/>
@@ -14147,34 +14073,25 @@
         </w:tc>
         <w:tc>
           <w:tcPr>
-            <w:tcW w:type="dxa" w:w="4950"/>
-            <w:tcBorders>
-              <w:top w:val="single" w:color="D9D4C5" w:sz="4"/>
-              <w:left w:val="single" w:color="D9D4C5" w:sz="4"/>
-              <w:bottom w:val="single" w:color="D9D4C5" w:sz="4"/>
-              <w:right w:val="single" w:color="D9D4C5" w:sz="4"/>
-            </w:tcBorders>
-            <w:tcMar>
-              <w:top w:type="dxa" w:w="70"/>
-              <w:left w:type="dxa" w:w="110"/>
-              <w:bottom w:type="dxa" w:w="70"/>
-              <w:right w:type="dxa" w:w="110"/>
-            </w:tcMar>
-            <w:vAlign w:val="center"/>
-          </w:tcPr>
-          <w:p>
-            <w:pPr>
-              <w:spacing w:after="0" w:before="0"/>
-            </w:pPr>
-            <w:r>
-              <w:rPr>
-                <w:rFonts w:ascii="Arial" w:cs="Arial" w:eastAsia="Arial" w:hAnsi="Arial"/>
-                <w:color w:val="1B2118"/>
-                <w:sz w:val="18"/>
-                <w:szCs w:val="18"/>
-              </w:rPr>
-              <w:t xml:space="preserve">Decidere la </w:t>
-            </w:r>
+            <w:tcW w:type="dxa" w:w="4739"/>
+            <w:tcBorders>
+              <w:top w:val="single" w:color="D9D4C5" w:sz="4"/>
+              <w:left w:val="single" w:color="D9D4C5" w:sz="4"/>
+              <w:bottom w:val="single" w:color="D9D4C5" w:sz="4"/>
+              <w:right w:val="single" w:color="D9D4C5" w:sz="4"/>
+            </w:tcBorders>
+            <w:tcMar>
+              <w:top w:type="dxa" w:w="70"/>
+              <w:left w:type="dxa" w:w="110"/>
+              <w:bottom w:type="dxa" w:w="70"/>
+              <w:right w:type="dxa" w:w="110"/>
+            </w:tcMar>
+            <w:vAlign w:val="center"/>
+          </w:tcPr>
+          <w:p>
+            <w:pPr>
+              <w:spacing w:after="0" w:before="0"/>
+            </w:pPr>
             <w:r>
               <w:rPr>
                 <w:rFonts w:ascii="Arial" w:cs="Arial" w:eastAsia="Arial" w:hAnsi="Arial"/>
@@ -14184,16 +14101,16 @@
                 <w:sz w:val="18"/>
                 <w:szCs w:val="18"/>
               </w:rPr>
-              <w:t xml:space="preserve">pseudonimizzazione</w:t>
-            </w:r>
-            <w:r>
-              <w:rPr>
-                <w:rFonts w:ascii="Arial" w:cs="Arial" w:eastAsia="Arial" w:hAnsi="Arial"/>
-                <w:color w:val="1B2118"/>
-                <w:sz w:val="18"/>
-                <w:szCs w:val="18"/>
-              </w:rPr>
-              <w:t xml:space="preserve"> (Proposta 1) e, se scelta, adattare modello e portale</w:t>
+              <w:t xml:space="preserve">Pseudonimizzazione</w:t>
+            </w:r>
+            <w:r>
+              <w:rPr>
+                <w:rFonts w:ascii="Arial" w:cs="Arial" w:eastAsia="Arial" w:hAnsi="Arial"/>
+                <w:color w:val="1B2118"/>
+                <w:sz w:val="18"/>
+                <w:szCs w:val="18"/>
+              </w:rPr>
+              <w:t xml:space="preserve"> (Proposta 1): modello e portale senza nomi e indirizzi</w:t>
             </w:r>
           </w:p>
         </w:tc>
@@ -14257,39 +14174,41 @@
                 <w:sz w:val="18"/>
                 <w:szCs w:val="18"/>
               </w:rPr>
-              <w:t xml:space="preserve">Comune e Fondazione</w:t>
-            </w:r>
-          </w:p>
-        </w:tc>
-        <w:tc>
-          <w:tcPr>
-            <w:tcW w:type="dxa" w:w="1260"/>
-            <w:tcBorders>
-              <w:top w:val="single" w:color="D9D4C5" w:sz="4"/>
-              <w:left w:val="single" w:color="D9D4C5" w:sz="4"/>
-              <w:bottom w:val="single" w:color="D9D4C5" w:sz="4"/>
-              <w:right w:val="single" w:color="D9D4C5" w:sz="4"/>
-            </w:tcBorders>
-            <w:tcMar>
-              <w:top w:type="dxa" w:w="70"/>
-              <w:left w:type="dxa" w:w="110"/>
-              <w:bottom w:type="dxa" w:w="70"/>
-              <w:right w:type="dxa" w:w="110"/>
-            </w:tcMar>
-            <w:vAlign w:val="center"/>
-          </w:tcPr>
-          <w:p>
-            <w:pPr>
-              <w:spacing w:after="0" w:before="0"/>
-            </w:pPr>
-            <w:r>
-              <w:rPr>
-                <w:rFonts w:ascii="Arial" w:cs="Arial" w:eastAsia="Arial" w:hAnsi="Arial"/>
-                <w:color w:val="1B2118"/>
-                <w:sz w:val="18"/>
-                <w:szCs w:val="18"/>
-              </w:rPr>
-              <w:t xml:space="preserve">Da decidere</w:t>
+              <w:t xml:space="preserve">Fondazione</w:t>
+            </w:r>
+          </w:p>
+        </w:tc>
+        <w:tc>
+          <w:tcPr>
+            <w:tcW w:type="dxa" w:w="1510"/>
+            <w:tcBorders>
+              <w:top w:val="single" w:color="D9D4C5" w:sz="4"/>
+              <w:left w:val="single" w:color="D9D4C5" w:sz="4"/>
+              <w:bottom w:val="single" w:color="D9D4C5" w:sz="4"/>
+              <w:right w:val="single" w:color="D9D4C5" w:sz="4"/>
+            </w:tcBorders>
+            <w:tcMar>
+              <w:top w:type="dxa" w:w="70"/>
+              <w:left w:type="dxa" w:w="110"/>
+              <w:bottom w:type="dxa" w:w="70"/>
+              <w:right w:type="dxa" w:w="110"/>
+            </w:tcMar>
+            <w:vAlign w:val="center"/>
+          </w:tcPr>
+          <w:p>
+            <w:pPr>
+              <w:spacing w:after="0" w:before="0"/>
+            </w:pPr>
+            <w:r>
+              <w:rPr>
+                <w:rFonts w:ascii="Arial" w:cs="Arial" w:eastAsia="Arial" w:hAnsi="Arial"/>
+                <w:b/>
+                <w:bCs/>
+                <w:color w:val="1B2118"/>
+                <w:sz w:val="18"/>
+                <w:szCs w:val="18"/>
+              </w:rPr>
+              <w:t xml:space="preserve">Fatto il 30/10/2026</w:t>
             </w:r>
           </w:p>
         </w:tc>
@@ -14300,7 +14219,7 @@
         </w:trPr>
         <w:tc>
           <w:tcPr>
-            <w:tcW w:type="dxa" w:w="908"/>
+            <w:tcW w:type="dxa" w:w="869"/>
             <w:tcBorders>
               <w:top w:val="single" w:color="D9D4C5" w:sz="4"/>
               <w:left w:val="single" w:color="D9D4C5" w:sz="4"/>
@@ -14333,7 +14252,7 @@
         </w:tc>
         <w:tc>
           <w:tcPr>
-            <w:tcW w:type="dxa" w:w="4950"/>
+            <w:tcW w:type="dxa" w:w="4739"/>
             <w:tcBorders>
               <w:top w:val="single" w:color="D9D4C5" w:sz="4"/>
               <w:left w:val="single" w:color="D9D4C5" w:sz="4"/>
@@ -14452,7 +14371,7 @@
         </w:tc>
         <w:tc>
           <w:tcPr>
-            <w:tcW w:type="dxa" w:w="1260"/>
+            <w:tcW w:type="dxa" w:w="1510"/>
             <w:tcBorders>
               <w:top w:val="single" w:color="D9D4C5" w:sz="4"/>
               <w:left w:val="single" w:color="D9D4C5" w:sz="4"/>
@@ -14490,7 +14409,7 @@
         </w:trPr>
         <w:tc>
           <w:tcPr>
-            <w:tcW w:type="dxa" w:w="908"/>
+            <w:tcW w:type="dxa" w:w="869"/>
             <w:tcBorders>
               <w:top w:val="single" w:color="D9D4C5" w:sz="4"/>
               <w:left w:val="single" w:color="D9D4C5" w:sz="4"/>
@@ -14522,7 +14441,7 @@
         </w:tc>
         <w:tc>
           <w:tcPr>
-            <w:tcW w:type="dxa" w:w="4950"/>
+            <w:tcW w:type="dxa" w:w="4739"/>
             <w:tcBorders>
               <w:top w:val="single" w:color="D9D4C5" w:sz="4"/>
               <w:left w:val="single" w:color="D9D4C5" w:sz="4"/>
@@ -14638,7 +14557,7 @@
         </w:tc>
         <w:tc>
           <w:tcPr>
-            <w:tcW w:type="dxa" w:w="1260"/>
+            <w:tcW w:type="dxa" w:w="1510"/>
             <w:tcBorders>
               <w:top w:val="single" w:color="D9D4C5" w:sz="4"/>
               <w:left w:val="single" w:color="D9D4C5" w:sz="4"/>
@@ -14675,7 +14594,7 @@
         </w:trPr>
         <w:tc>
           <w:tcPr>
-            <w:tcW w:type="dxa" w:w="908"/>
+            <w:tcW w:type="dxa" w:w="869"/>
             <w:tcBorders>
               <w:top w:val="single" w:color="D9D4C5" w:sz="4"/>
               <w:left w:val="single" w:color="D9D4C5" w:sz="4"/>
@@ -14708,7 +14627,7 @@
         </w:tc>
         <w:tc>
           <w:tcPr>
-            <w:tcW w:type="dxa" w:w="4950"/>
+            <w:tcW w:type="dxa" w:w="4739"/>
             <w:tcBorders>
               <w:top w:val="single" w:color="D9D4C5" w:sz="4"/>
               <w:left w:val="single" w:color="D9D4C5" w:sz="4"/>
@@ -14827,7 +14746,7 @@
         </w:tc>
         <w:tc>
           <w:tcPr>
-            <w:tcW w:type="dxa" w:w="1260"/>
+            <w:tcW w:type="dxa" w:w="1510"/>
             <w:tcBorders>
               <w:top w:val="single" w:color="D9D4C5" w:sz="4"/>
               <w:left w:val="single" w:color="D9D4C5" w:sz="4"/>
@@ -14865,7 +14784,7 @@
         </w:trPr>
         <w:tc>
           <w:tcPr>
-            <w:tcW w:type="dxa" w:w="908"/>
+            <w:tcW w:type="dxa" w:w="869"/>
             <w:tcBorders>
               <w:top w:val="single" w:color="D9D4C5" w:sz="4"/>
               <w:left w:val="single" w:color="D9D4C5" w:sz="4"/>
@@ -14897,7 +14816,7 @@
         </w:tc>
         <w:tc>
           <w:tcPr>
-            <w:tcW w:type="dxa" w:w="4950"/>
+            <w:tcW w:type="dxa" w:w="4739"/>
             <w:tcBorders>
               <w:top w:val="single" w:color="D9D4C5" w:sz="4"/>
               <w:left w:val="single" w:color="D9D4C5" w:sz="4"/>
@@ -15013,7 +14932,7 @@
         </w:tc>
         <w:tc>
           <w:tcPr>
-            <w:tcW w:type="dxa" w:w="1260"/>
+            <w:tcW w:type="dxa" w:w="1510"/>
             <w:tcBorders>
               <w:top w:val="single" w:color="D9D4C5" w:sz="4"/>
               <w:left w:val="single" w:color="D9D4C5" w:sz="4"/>
@@ -15050,7 +14969,7 @@
         </w:trPr>
         <w:tc>
           <w:tcPr>
-            <w:tcW w:type="dxa" w:w="908"/>
+            <w:tcW w:type="dxa" w:w="869"/>
             <w:tcBorders>
               <w:top w:val="single" w:color="D9D4C5" w:sz="4"/>
               <w:left w:val="single" w:color="D9D4C5" w:sz="4"/>
@@ -15083,7 +15002,7 @@
         </w:tc>
         <w:tc>
           <w:tcPr>
-            <w:tcW w:type="dxa" w:w="4950"/>
+            <w:tcW w:type="dxa" w:w="4739"/>
             <w:tcBorders>
               <w:top w:val="single" w:color="D9D4C5" w:sz="4"/>
               <w:left w:val="single" w:color="D9D4C5" w:sz="4"/>
@@ -15202,7 +15121,7 @@
         </w:tc>
         <w:tc>
           <w:tcPr>
-            <w:tcW w:type="dxa" w:w="1260"/>
+            <w:tcW w:type="dxa" w:w="1510"/>
             <w:tcBorders>
               <w:top w:val="single" w:color="D9D4C5" w:sz="4"/>
               <w:left w:val="single" w:color="D9D4C5" w:sz="4"/>
@@ -15240,7 +15159,7 @@
         </w:trPr>
         <w:tc>
           <w:tcPr>
-            <w:tcW w:type="dxa" w:w="908"/>
+            <w:tcW w:type="dxa" w:w="869"/>
             <w:tcBorders>
               <w:top w:val="single" w:color="D9D4C5" w:sz="4"/>
               <w:left w:val="single" w:color="D9D4C5" w:sz="4"/>
@@ -15272,7 +15191,7 @@
         </w:tc>
         <w:tc>
           <w:tcPr>
-            <w:tcW w:type="dxa" w:w="4950"/>
+            <w:tcW w:type="dxa" w:w="4739"/>
             <w:tcBorders>
               <w:top w:val="single" w:color="D9D4C5" w:sz="4"/>
               <w:left w:val="single" w:color="D9D4C5" w:sz="4"/>
@@ -15388,7 +15307,7 @@
         </w:tc>
         <w:tc>
           <w:tcPr>
-            <w:tcW w:type="dxa" w:w="1260"/>
+            <w:tcW w:type="dxa" w:w="1510"/>
             <w:tcBorders>
               <w:top w:val="single" w:color="D9D4C5" w:sz="4"/>
               <w:left w:val="single" w:color="D9D4C5" w:sz="4"/>
@@ -15425,7 +15344,7 @@
         </w:trPr>
         <w:tc>
           <w:tcPr>
-            <w:tcW w:type="dxa" w:w="908"/>
+            <w:tcW w:type="dxa" w:w="869"/>
             <w:tcBorders>
               <w:top w:val="single" w:color="D9D4C5" w:sz="4"/>
               <w:left w:val="single" w:color="D9D4C5" w:sz="4"/>
@@ -15458,7 +15377,7 @@
         </w:tc>
         <w:tc>
           <w:tcPr>
-            <w:tcW w:type="dxa" w:w="4950"/>
+            <w:tcW w:type="dxa" w:w="4739"/>
             <w:tcBorders>
               <w:top w:val="single" w:color="D9D4C5" w:sz="4"/>
               <w:left w:val="single" w:color="D9D4C5" w:sz="4"/>
@@ -15597,7 +15516,7 @@
         </w:tc>
         <w:tc>
           <w:tcPr>
-            <w:tcW w:type="dxa" w:w="1260"/>
+            <w:tcW w:type="dxa" w:w="1510"/>
             <w:tcBorders>
               <w:top w:val="single" w:color="D9D4C5" w:sz="4"/>
               <w:left w:val="single" w:color="D9D4C5" w:sz="4"/>
@@ -15635,7 +15554,7 @@
         </w:trPr>
         <w:tc>
           <w:tcPr>
-            <w:tcW w:type="dxa" w:w="908"/>
+            <w:tcW w:type="dxa" w:w="869"/>
             <w:tcBorders>
               <w:top w:val="single" w:color="D9D4C5" w:sz="4"/>
               <w:left w:val="single" w:color="D9D4C5" w:sz="4"/>
@@ -15667,7 +15586,7 @@
         </w:tc>
         <w:tc>
           <w:tcPr>
-            <w:tcW w:type="dxa" w:w="4950"/>
+            <w:tcW w:type="dxa" w:w="4739"/>
             <w:tcBorders>
               <w:top w:val="single" w:color="D9D4C5" w:sz="4"/>
               <w:left w:val="single" w:color="D9D4C5" w:sz="4"/>
@@ -15794,7 +15713,7 @@
         </w:tc>
         <w:tc>
           <w:tcPr>
-            <w:tcW w:type="dxa" w:w="1260"/>
+            <w:tcW w:type="dxa" w:w="1510"/>
             <w:tcBorders>
               <w:top w:val="single" w:color="D9D4C5" w:sz="4"/>
               <w:left w:val="single" w:color="D9D4C5" w:sz="4"/>
@@ -15831,7 +15750,7 @@
         </w:trPr>
         <w:tc>
           <w:tcPr>
-            <w:tcW w:type="dxa" w:w="908"/>
+            <w:tcW w:type="dxa" w:w="869"/>
             <w:tcBorders>
               <w:top w:val="single" w:color="D9D4C5" w:sz="4"/>
               <w:left w:val="single" w:color="D9D4C5" w:sz="4"/>
@@ -15864,7 +15783,7 @@
         </w:tc>
         <w:tc>
           <w:tcPr>
-            <w:tcW w:type="dxa" w:w="4950"/>
+            <w:tcW w:type="dxa" w:w="4739"/>
             <w:tcBorders>
               <w:top w:val="single" w:color="D9D4C5" w:sz="4"/>
               <w:left w:val="single" w:color="D9D4C5" w:sz="4"/>
@@ -15963,7 +15882,7 @@
         </w:tc>
         <w:tc>
           <w:tcPr>
-            <w:tcW w:type="dxa" w:w="1260"/>
+            <w:tcW w:type="dxa" w:w="1510"/>
             <w:tcBorders>
               <w:top w:val="single" w:color="D9D4C5" w:sz="4"/>
               <w:left w:val="single" w:color="D9D4C5" w:sz="4"/>
@@ -16001,7 +15920,7 @@
         </w:trPr>
         <w:tc>
           <w:tcPr>
-            <w:tcW w:type="dxa" w:w="908"/>
+            <w:tcW w:type="dxa" w:w="869"/>
             <w:tcBorders>
               <w:top w:val="single" w:color="D9D4C5" w:sz="4"/>
               <w:left w:val="single" w:color="D9D4C5" w:sz="4"/>
@@ -16033,7 +15952,7 @@
         </w:tc>
         <w:tc>
           <w:tcPr>
-            <w:tcW w:type="dxa" w:w="4950"/>
+            <w:tcW w:type="dxa" w:w="4739"/>
             <w:tcBorders>
               <w:top w:val="single" w:color="D9D4C5" w:sz="4"/>
               <w:left w:val="single" w:color="D9D4C5" w:sz="4"/>
@@ -16149,7 +16068,7 @@
         </w:tc>
         <w:tc>
           <w:tcPr>
-            <w:tcW w:type="dxa" w:w="1260"/>
+            <w:tcW w:type="dxa" w:w="1510"/>
             <w:tcBorders>
               <w:top w:val="single" w:color="D9D4C5" w:sz="4"/>
               <w:left w:val="single" w:color="D9D4C5" w:sz="4"/>
@@ -16186,7 +16105,7 @@
         </w:trPr>
         <w:tc>
           <w:tcPr>
-            <w:tcW w:type="dxa" w:w="908"/>
+            <w:tcW w:type="dxa" w:w="869"/>
             <w:tcBorders>
               <w:top w:val="single" w:color="D9D4C5" w:sz="4"/>
               <w:left w:val="single" w:color="D9D4C5" w:sz="4"/>
@@ -16219,7 +16138,7 @@
         </w:tc>
         <w:tc>
           <w:tcPr>
-            <w:tcW w:type="dxa" w:w="4950"/>
+            <w:tcW w:type="dxa" w:w="4739"/>
             <w:tcBorders>
               <w:top w:val="single" w:color="D9D4C5" w:sz="4"/>
               <w:left w:val="single" w:color="D9D4C5" w:sz="4"/>
@@ -16318,7 +16237,7 @@
         </w:tc>
         <w:tc>
           <w:tcPr>
-            <w:tcW w:type="dxa" w:w="1260"/>
+            <w:tcW w:type="dxa" w:w="1510"/>
             <w:tcBorders>
               <w:top w:val="single" w:color="D9D4C5" w:sz="4"/>
               <w:left w:val="single" w:color="D9D4C5" w:sz="4"/>
@@ -16961,7 +16880,7 @@
         <w:szCs w:val="16"/>
       </w:rPr>
       <w:tab/>
-      <w:t xml:space="preserve">DPIA Banca Dati Utenze · Rev. 1.0 · 26/10/2026</w:t>
+      <w:t xml:space="preserve">DPIA Banca Dati Utenze · Rev. 1.1 · 30/10/2026</w:t>
     </w:r>
   </w:p>
 </w:hdr>
@@ -17026,7 +16945,7 @@
         <w:szCs w:val="16"/>
       </w:rPr>
       <w:tab/>
-      <w:t xml:space="preserve">DPIA Banca Dati Utenze · Rev. 1.0 · 26/10/2026</w:t>
+      <w:t xml:space="preserve">DPIA Banca Dati Utenze · Rev. 1.1 · 30/10/2026</w:t>
     </w:r>
   </w:p>
 </w:hdr>

</xml_diff>

<commit_message>
Rilascio del 31/10: script 48 in produzione, pulizia del simulatore, documenti aggiornati
- Registro 8.5 (versione 0.48, script 01-48), Registro issue 1.29 (rilievi T in produzione)
- simulatore: tolta taraVariabilita e commenti EsaCom; crediti-cwp.md allineato a T10
- manuali (Utente 4.7, Amministratore 6.10, Test 3.30), DPIA 1.2, presentazione 4.5, base di conoscenza

Co-Authored-By: Claude Opus 5.5 <noreply@anthropic.com>
Claude-Session: https://claude.ai/code/session_01E8XCbEeVHWVP3hntUZ6kZ1
</commit_message>
<xml_diff>
--- a/public/documentazione/DPIA_Banca_Dati_Utenze_Portale_CWP.docx
+++ b/public/documentazione/DPIA_Banca_Dati_Utenze_Portale_CWP.docx
@@ -302,7 +302,7 @@
                 <w:sz w:val="20"/>
                 <w:szCs w:val="20"/>
               </w:rPr>
-              <w:t xml:space="preserve">Rev. 1.1</w:t>
+              <w:t xml:space="preserve">Rev. 1.2</w:t>
             </w:r>
           </w:p>
         </w:tc>
@@ -365,7 +365,7 @@
                 <w:sz w:val="20"/>
                 <w:szCs w:val="20"/>
               </w:rPr>
-              <w:t xml:space="preserve">30/10/2026</w:t>
+              <w:t xml:space="preserve">31/10/2026</w:t>
             </w:r>
           </w:p>
         </w:tc>
@@ -719,7 +719,7 @@
                 <w:sz w:val="18"/>
                 <w:szCs w:val="18"/>
               </w:rPr>
-              <w:t xml:space="preserve">1.1</w:t>
+              <w:t xml:space="preserve">1.2</w:t>
             </w:r>
           </w:p>
         </w:tc>
@@ -751,7 +751,7 @@
                 <w:sz w:val="18"/>
                 <w:szCs w:val="18"/>
               </w:rPr>
-              <w:t xml:space="preserve">30/10/2026</w:t>
+              <w:t xml:space="preserve">31/10/2026</w:t>
             </w:r>
           </w:p>
         </w:tc>
@@ -783,7 +783,7 @@
                 <w:sz w:val="18"/>
                 <w:szCs w:val="18"/>
               </w:rPr>
-              <w:t xml:space="preserve">Pseudonimizzazione applicata nel portale (azione A1): Banca Dati Utenze senza nomi e indirizzi.</w:t>
+              <w:t xml:space="preserve">Pseudonimizzazione (azione A1) in produzione dal 31/10/2026.</w:t>
             </w:r>
           </w:p>
         </w:tc>
@@ -853,6 +853,142 @@
                 <w:sz w:val="18"/>
                 <w:szCs w:val="18"/>
               </w:rPr>
+              <w:t xml:space="preserve">1.1</w:t>
+            </w:r>
+          </w:p>
+        </w:tc>
+        <w:tc>
+          <w:tcPr>
+            <w:tcW w:type="dxa" w:w="1300"/>
+            <w:tcBorders>
+              <w:top w:val="single" w:color="D9D4C5" w:sz="4"/>
+              <w:left w:val="single" w:color="D9D4C5" w:sz="4"/>
+              <w:bottom w:val="single" w:color="D9D4C5" w:sz="4"/>
+              <w:right w:val="single" w:color="D9D4C5" w:sz="4"/>
+            </w:tcBorders>
+            <w:shd w:fill="F6F4EE" w:color="auto" w:val="clear"/>
+            <w:tcMar>
+              <w:top w:type="dxa" w:w="70"/>
+              <w:left w:type="dxa" w:w="110"/>
+              <w:bottom w:type="dxa" w:w="70"/>
+              <w:right w:type="dxa" w:w="110"/>
+            </w:tcMar>
+            <w:vAlign w:val="center"/>
+          </w:tcPr>
+          <w:p>
+            <w:pPr>
+              <w:spacing w:after="0" w:before="0"/>
+            </w:pPr>
+            <w:r>
+              <w:rPr>
+                <w:rFonts w:ascii="Arial" w:cs="Arial" w:eastAsia="Arial" w:hAnsi="Arial"/>
+                <w:color w:val="1B2118"/>
+                <w:sz w:val="18"/>
+                <w:szCs w:val="18"/>
+              </w:rPr>
+              <w:t xml:space="preserve">30/10/2026</w:t>
+            </w:r>
+          </w:p>
+        </w:tc>
+        <w:tc>
+          <w:tcPr>
+            <w:tcW w:type="dxa" w:w="5538"/>
+            <w:tcBorders>
+              <w:top w:val="single" w:color="D9D4C5" w:sz="4"/>
+              <w:left w:val="single" w:color="D9D4C5" w:sz="4"/>
+              <w:bottom w:val="single" w:color="D9D4C5" w:sz="4"/>
+              <w:right w:val="single" w:color="D9D4C5" w:sz="4"/>
+            </w:tcBorders>
+            <w:shd w:fill="F6F4EE" w:color="auto" w:val="clear"/>
+            <w:tcMar>
+              <w:top w:type="dxa" w:w="70"/>
+              <w:left w:type="dxa" w:w="110"/>
+              <w:bottom w:type="dxa" w:w="70"/>
+              <w:right w:type="dxa" w:w="110"/>
+            </w:tcMar>
+            <w:vAlign w:val="center"/>
+          </w:tcPr>
+          <w:p>
+            <w:pPr>
+              <w:spacing w:after="0" w:before="0"/>
+            </w:pPr>
+            <w:r>
+              <w:rPr>
+                <w:rFonts w:ascii="Arial" w:cs="Arial" w:eastAsia="Arial" w:hAnsi="Arial"/>
+                <w:color w:val="1B2118"/>
+                <w:sz w:val="18"/>
+                <w:szCs w:val="18"/>
+              </w:rPr>
+              <w:t xml:space="preserve">Pseudonimizzazione applicata nel portale (azione A1): Banca Dati Utenze senza nomi e indirizzi.</w:t>
+            </w:r>
+          </w:p>
+        </w:tc>
+        <w:tc>
+          <w:tcPr>
+            <w:tcW w:type="dxa" w:w="2000"/>
+            <w:tcBorders>
+              <w:top w:val="single" w:color="D9D4C5" w:sz="4"/>
+              <w:left w:val="single" w:color="D9D4C5" w:sz="4"/>
+              <w:bottom w:val="single" w:color="D9D4C5" w:sz="4"/>
+              <w:right w:val="single" w:color="D9D4C5" w:sz="4"/>
+            </w:tcBorders>
+            <w:shd w:fill="F6F4EE" w:color="auto" w:val="clear"/>
+            <w:tcMar>
+              <w:top w:type="dxa" w:w="70"/>
+              <w:left w:type="dxa" w:w="110"/>
+              <w:bottom w:type="dxa" w:w="70"/>
+              <w:right w:type="dxa" w:w="110"/>
+            </w:tcMar>
+            <w:vAlign w:val="center"/>
+          </w:tcPr>
+          <w:p>
+            <w:pPr>
+              <w:spacing w:after="0" w:before="0"/>
+            </w:pPr>
+            <w:r>
+              <w:rPr>
+                <w:rFonts w:ascii="Arial" w:cs="Arial" w:eastAsia="Arial" w:hAnsi="Arial"/>
+                <w:color w:val="1B2118"/>
+                <w:sz w:val="18"/>
+                <w:szCs w:val="18"/>
+              </w:rPr>
+              <w:t xml:space="preserve">Fondazione Operate</w:t>
+            </w:r>
+          </w:p>
+        </w:tc>
+      </w:tr>
+      <w:tr>
+        <w:trPr>
+          <w:cantSplit/>
+        </w:trPr>
+        <w:tc>
+          <w:tcPr>
+            <w:tcW w:type="dxa" w:w="800"/>
+            <w:tcBorders>
+              <w:top w:val="single" w:color="D9D4C5" w:sz="4"/>
+              <w:left w:val="single" w:color="D9D4C5" w:sz="4"/>
+              <w:bottom w:val="single" w:color="D9D4C5" w:sz="4"/>
+              <w:right w:val="single" w:color="D9D4C5" w:sz="4"/>
+            </w:tcBorders>
+            <w:tcMar>
+              <w:top w:type="dxa" w:w="70"/>
+              <w:left w:type="dxa" w:w="110"/>
+              <w:bottom w:type="dxa" w:w="70"/>
+              <w:right w:type="dxa" w:w="110"/>
+            </w:tcMar>
+            <w:vAlign w:val="center"/>
+          </w:tcPr>
+          <w:p>
+            <w:pPr>
+              <w:spacing w:after="0" w:before="0"/>
+            </w:pPr>
+            <w:r>
+              <w:rPr>
+                <w:rFonts w:ascii="Arial" w:cs="Arial" w:eastAsia="Arial" w:hAnsi="Arial"/>
+                <w:color w:val="1B2118"/>
+                <w:sz w:val="18"/>
+                <w:szCs w:val="18"/>
+              </w:rPr>
               <w:t xml:space="preserve">1.0</w:t>
             </w:r>
           </w:p>
@@ -866,7 +1002,6 @@
               <w:bottom w:val="single" w:color="D9D4C5" w:sz="4"/>
               <w:right w:val="single" w:color="D9D4C5" w:sz="4"/>
             </w:tcBorders>
-            <w:shd w:fill="F6F4EE" w:color="auto" w:val="clear"/>
             <w:tcMar>
               <w:top w:type="dxa" w:w="70"/>
               <w:left w:type="dxa" w:w="110"/>
@@ -899,7 +1034,6 @@
               <w:bottom w:val="single" w:color="D9D4C5" w:sz="4"/>
               <w:right w:val="single" w:color="D9D4C5" w:sz="4"/>
             </w:tcBorders>
-            <w:shd w:fill="F6F4EE" w:color="auto" w:val="clear"/>
             <w:tcMar>
               <w:top w:type="dxa" w:w="70"/>
               <w:left w:type="dxa" w:w="110"/>
@@ -932,7 +1066,6 @@
               <w:bottom w:val="single" w:color="D9D4C5" w:sz="4"/>
               <w:right w:val="single" w:color="D9D4C5" w:sz="4"/>
             </w:tcBorders>
-            <w:shd w:fill="F6F4EE" w:color="auto" w:val="clear"/>
             <w:tcMar>
               <w:top w:type="dxa" w:w="70"/>
               <w:left w:type="dxa" w:w="110"/>
@@ -974,7 +1107,7 @@
           <w:sz w:val="20"/>
           <w:szCs w:val="20"/>
         </w:rPr>
-        <w:t xml:space="preserve">Traccia alla revisione 1.1 del 30/10/2026, preparata dalla Fondazione Operate: descrive il portale; le parti segnate «da completare» spettano al Comune e al suo DPO. Non è un parere legale. Si aggiorna quando cambia il trattamento delle utenze nel portale; la versione corrente (anche in Word, da completare) si scarica dall'area Documentazione del portale (solo Amministratori).</w:t>
+        <w:t xml:space="preserve">Traccia alla revisione 1.2 del 31/10/2026, preparata dalla Fondazione Operate: descrive il portale; le parti segnate «da completare» spettano al Comune e al suo DPO. Non è un parere legale. Si aggiorna quando cambia il trattamento delle utenze nel portale; la versione corrente (anche in Word, da completare) si scarica dall'area Documentazione del portale (solo Amministratori).</w:t>
       </w:r>
     </w:p>
     <w:p>
@@ -5263,7 +5396,7 @@
           <w:sz w:val="21"/>
           <w:szCs w:val="21"/>
         </w:rPr>
-        <w:t xml:space="preserve"> nome del capofamiglia o ragione sociale e indirizzo (dal 30/10/2026: il portale non li chiede e, se un file li contiene, li ignora), codice fiscale, data di nascita, telefono, email, dati di pagamento, situazione economica, riduzioni o agevolazioni (che potrebbero rivelare condizioni di salute o di disagio).</w:t>
+        <w:t xml:space="preserve"> nome del capofamiglia o ragione sociale e indirizzo (dal 31/10/2026: il portale non li chiede e, se un file li contiene, li ignora), codice fiscale, data di nascita, telefono, email, dati di pagamento, situazione economica, riduzioni o agevolazioni (che potrebbero rivelare condizioni di salute o di disagio).</w:t>
       </w:r>
     </w:p>
     <w:p>
@@ -5347,7 +5480,7 @@
           <w:sz w:val="21"/>
           <w:szCs w:val="21"/>
         </w:rPr>
-        <w:t xml:space="preserve">: basta il codice dell'utenza. Dal 30/10/2026 il portale applica la </w:t>
+        <w:t xml:space="preserve">: basta il codice dell'utenza. Dal 31/10/2026 il portale applica la </w:t>
       </w:r>
       <w:r>
         <w:rPr>
@@ -9482,7 +9615,7 @@
                 <w:sz w:val="18"/>
                 <w:szCs w:val="18"/>
               </w:rPr>
-              <w:t xml:space="preserve"> e dal 30/10/2026 il portale non li tratta</w:t>
+              <w:t xml:space="preserve"> e dal 31/10/2026 il portale non li tratta</w:t>
             </w:r>
           </w:p>
         </w:tc>
@@ -10113,7 +10246,7 @@
           <w:sz w:val="21"/>
           <w:szCs w:val="21"/>
         </w:rPr>
-        <w:t xml:space="preserve">Applicata nel portale dal 30/10/2026</w:t>
+        <w:t xml:space="preserve">Applicata nel portale dal 31/10/2026</w:t>
       </w:r>
       <w:r>
         <w:rPr>
@@ -10440,7 +10573,7 @@
           <w:sz w:val="21"/>
           <w:szCs w:val="21"/>
         </w:rPr>
-        <w:t xml:space="preserve"> nel portale; la colonna «Livello» è stata stimata prima della pseudonimizzazione (applicata dal 30/10/2026, azione A1), quindi è prudente; la colonna a destra indica il livello dopo il piano d'azione.</w:t>
+        <w:t xml:space="preserve"> nel portale; la colonna «Livello» è stata stimata prima della pseudonimizzazione (applicata dal 31/10/2026, azione A1), quindi è prudente; la colonna a destra indica il livello dopo il piano d'azione.</w:t>
       </w:r>
     </w:p>
     <w:tbl>
@@ -13849,11 +13982,11 @@
         <w:tblLayout w:type="fixed"/>
       </w:tblPr>
       <w:tblGrid>
-        <w:gridCol w:w="869"/>
-        <w:gridCol w:w="4739"/>
+        <w:gridCol w:w="837"/>
+        <w:gridCol w:w="4568"/>
         <w:gridCol w:w="1010"/>
         <w:gridCol w:w="1510"/>
-        <w:gridCol w:w="1510"/>
+        <w:gridCol w:w="1713"/>
       </w:tblGrid>
       <w:tr>
         <w:trPr>
@@ -13861,7 +13994,7 @@
         </w:trPr>
         <w:tc>
           <w:tcPr>
-            <w:tcW w:type="dxa" w:w="869"/>
+            <w:tcW w:type="dxa" w:w="837"/>
             <w:tcBorders>
               <w:top w:val="single" w:color="D9D4C5" w:sz="4"/>
               <w:left w:val="single" w:color="D9D4C5" w:sz="4"/>
@@ -13896,7 +14029,7 @@
         </w:tc>
         <w:tc>
           <w:tcPr>
-            <w:tcW w:type="dxa" w:w="4739"/>
+            <w:tcW w:type="dxa" w:w="4568"/>
             <w:tcBorders>
               <w:top w:val="single" w:color="D9D4C5" w:sz="4"/>
               <w:left w:val="single" w:color="D9D4C5" w:sz="4"/>
@@ -14001,7 +14134,7 @@
         </w:tc>
         <w:tc>
           <w:tcPr>
-            <w:tcW w:type="dxa" w:w="1510"/>
+            <w:tcW w:type="dxa" w:w="1713"/>
             <w:tcBorders>
               <w:top w:val="single" w:color="D9D4C5" w:sz="4"/>
               <w:left w:val="single" w:color="D9D4C5" w:sz="4"/>
@@ -14041,7 +14174,7 @@
         </w:trPr>
         <w:tc>
           <w:tcPr>
-            <w:tcW w:type="dxa" w:w="869"/>
+            <w:tcW w:type="dxa" w:w="837"/>
             <w:tcBorders>
               <w:top w:val="single" w:color="D9D4C5" w:sz="4"/>
               <w:left w:val="single" w:color="D9D4C5" w:sz="4"/>
@@ -14073,7 +14206,7 @@
         </w:tc>
         <w:tc>
           <w:tcPr>
-            <w:tcW w:type="dxa" w:w="4739"/>
+            <w:tcW w:type="dxa" w:w="4568"/>
             <w:tcBorders>
               <w:top w:val="single" w:color="D9D4C5" w:sz="4"/>
               <w:left w:val="single" w:color="D9D4C5" w:sz="4"/>
@@ -14180,7 +14313,7 @@
         </w:tc>
         <w:tc>
           <w:tcPr>
-            <w:tcW w:type="dxa" w:w="1510"/>
+            <w:tcW w:type="dxa" w:w="1713"/>
             <w:tcBorders>
               <w:top w:val="single" w:color="D9D4C5" w:sz="4"/>
               <w:left w:val="single" w:color="D9D4C5" w:sz="4"/>
@@ -14208,7 +14341,16 @@
                 <w:sz w:val="18"/>
                 <w:szCs w:val="18"/>
               </w:rPr>
-              <w:t xml:space="preserve">Fatto il 30/10/2026</w:t>
+              <w:t xml:space="preserve">Fatto il 31/10/2026</w:t>
+            </w:r>
+            <w:r>
+              <w:rPr>
+                <w:rFonts w:ascii="Arial" w:cs="Arial" w:eastAsia="Arial" w:hAnsi="Arial"/>
+                <w:color w:val="1B2118"/>
+                <w:sz w:val="18"/>
+                <w:szCs w:val="18"/>
+              </w:rPr>
+              <w:t xml:space="preserve"> (in produzione)</w:t>
             </w:r>
           </w:p>
         </w:tc>
@@ -14219,7 +14361,7 @@
         </w:trPr>
         <w:tc>
           <w:tcPr>
-            <w:tcW w:type="dxa" w:w="869"/>
+            <w:tcW w:type="dxa" w:w="837"/>
             <w:tcBorders>
               <w:top w:val="single" w:color="D9D4C5" w:sz="4"/>
               <w:left w:val="single" w:color="D9D4C5" w:sz="4"/>
@@ -14252,7 +14394,7 @@
         </w:tc>
         <w:tc>
           <w:tcPr>
-            <w:tcW w:type="dxa" w:w="4739"/>
+            <w:tcW w:type="dxa" w:w="4568"/>
             <w:tcBorders>
               <w:top w:val="single" w:color="D9D4C5" w:sz="4"/>
               <w:left w:val="single" w:color="D9D4C5" w:sz="4"/>
@@ -14371,7 +14513,7 @@
         </w:tc>
         <w:tc>
           <w:tcPr>
-            <w:tcW w:type="dxa" w:w="1510"/>
+            <w:tcW w:type="dxa" w:w="1713"/>
             <w:tcBorders>
               <w:top w:val="single" w:color="D9D4C5" w:sz="4"/>
               <w:left w:val="single" w:color="D9D4C5" w:sz="4"/>
@@ -14409,7 +14551,7 @@
         </w:trPr>
         <w:tc>
           <w:tcPr>
-            <w:tcW w:type="dxa" w:w="869"/>
+            <w:tcW w:type="dxa" w:w="837"/>
             <w:tcBorders>
               <w:top w:val="single" w:color="D9D4C5" w:sz="4"/>
               <w:left w:val="single" w:color="D9D4C5" w:sz="4"/>
@@ -14441,7 +14583,7 @@
         </w:tc>
         <w:tc>
           <w:tcPr>
-            <w:tcW w:type="dxa" w:w="4739"/>
+            <w:tcW w:type="dxa" w:w="4568"/>
             <w:tcBorders>
               <w:top w:val="single" w:color="D9D4C5" w:sz="4"/>
               <w:left w:val="single" w:color="D9D4C5" w:sz="4"/>
@@ -14557,7 +14699,7 @@
         </w:tc>
         <w:tc>
           <w:tcPr>
-            <w:tcW w:type="dxa" w:w="1510"/>
+            <w:tcW w:type="dxa" w:w="1713"/>
             <w:tcBorders>
               <w:top w:val="single" w:color="D9D4C5" w:sz="4"/>
               <w:left w:val="single" w:color="D9D4C5" w:sz="4"/>
@@ -14594,7 +14736,7 @@
         </w:trPr>
         <w:tc>
           <w:tcPr>
-            <w:tcW w:type="dxa" w:w="869"/>
+            <w:tcW w:type="dxa" w:w="837"/>
             <w:tcBorders>
               <w:top w:val="single" w:color="D9D4C5" w:sz="4"/>
               <w:left w:val="single" w:color="D9D4C5" w:sz="4"/>
@@ -14627,7 +14769,7 @@
         </w:tc>
         <w:tc>
           <w:tcPr>
-            <w:tcW w:type="dxa" w:w="4739"/>
+            <w:tcW w:type="dxa" w:w="4568"/>
             <w:tcBorders>
               <w:top w:val="single" w:color="D9D4C5" w:sz="4"/>
               <w:left w:val="single" w:color="D9D4C5" w:sz="4"/>
@@ -14746,7 +14888,7 @@
         </w:tc>
         <w:tc>
           <w:tcPr>
-            <w:tcW w:type="dxa" w:w="1510"/>
+            <w:tcW w:type="dxa" w:w="1713"/>
             <w:tcBorders>
               <w:top w:val="single" w:color="D9D4C5" w:sz="4"/>
               <w:left w:val="single" w:color="D9D4C5" w:sz="4"/>
@@ -14784,7 +14926,7 @@
         </w:trPr>
         <w:tc>
           <w:tcPr>
-            <w:tcW w:type="dxa" w:w="869"/>
+            <w:tcW w:type="dxa" w:w="837"/>
             <w:tcBorders>
               <w:top w:val="single" w:color="D9D4C5" w:sz="4"/>
               <w:left w:val="single" w:color="D9D4C5" w:sz="4"/>
@@ -14816,7 +14958,7 @@
         </w:tc>
         <w:tc>
           <w:tcPr>
-            <w:tcW w:type="dxa" w:w="4739"/>
+            <w:tcW w:type="dxa" w:w="4568"/>
             <w:tcBorders>
               <w:top w:val="single" w:color="D9D4C5" w:sz="4"/>
               <w:left w:val="single" w:color="D9D4C5" w:sz="4"/>
@@ -14932,7 +15074,7 @@
         </w:tc>
         <w:tc>
           <w:tcPr>
-            <w:tcW w:type="dxa" w:w="1510"/>
+            <w:tcW w:type="dxa" w:w="1713"/>
             <w:tcBorders>
               <w:top w:val="single" w:color="D9D4C5" w:sz="4"/>
               <w:left w:val="single" w:color="D9D4C5" w:sz="4"/>
@@ -14969,7 +15111,7 @@
         </w:trPr>
         <w:tc>
           <w:tcPr>
-            <w:tcW w:type="dxa" w:w="869"/>
+            <w:tcW w:type="dxa" w:w="837"/>
             <w:tcBorders>
               <w:top w:val="single" w:color="D9D4C5" w:sz="4"/>
               <w:left w:val="single" w:color="D9D4C5" w:sz="4"/>
@@ -15002,7 +15144,7 @@
         </w:tc>
         <w:tc>
           <w:tcPr>
-            <w:tcW w:type="dxa" w:w="4739"/>
+            <w:tcW w:type="dxa" w:w="4568"/>
             <w:tcBorders>
               <w:top w:val="single" w:color="D9D4C5" w:sz="4"/>
               <w:left w:val="single" w:color="D9D4C5" w:sz="4"/>
@@ -15121,7 +15263,7 @@
         </w:tc>
         <w:tc>
           <w:tcPr>
-            <w:tcW w:type="dxa" w:w="1510"/>
+            <w:tcW w:type="dxa" w:w="1713"/>
             <w:tcBorders>
               <w:top w:val="single" w:color="D9D4C5" w:sz="4"/>
               <w:left w:val="single" w:color="D9D4C5" w:sz="4"/>
@@ -15159,7 +15301,7 @@
         </w:trPr>
         <w:tc>
           <w:tcPr>
-            <w:tcW w:type="dxa" w:w="869"/>
+            <w:tcW w:type="dxa" w:w="837"/>
             <w:tcBorders>
               <w:top w:val="single" w:color="D9D4C5" w:sz="4"/>
               <w:left w:val="single" w:color="D9D4C5" w:sz="4"/>
@@ -15191,7 +15333,7 @@
         </w:tc>
         <w:tc>
           <w:tcPr>
-            <w:tcW w:type="dxa" w:w="4739"/>
+            <w:tcW w:type="dxa" w:w="4568"/>
             <w:tcBorders>
               <w:top w:val="single" w:color="D9D4C5" w:sz="4"/>
               <w:left w:val="single" w:color="D9D4C5" w:sz="4"/>
@@ -15307,7 +15449,7 @@
         </w:tc>
         <w:tc>
           <w:tcPr>
-            <w:tcW w:type="dxa" w:w="1510"/>
+            <w:tcW w:type="dxa" w:w="1713"/>
             <w:tcBorders>
               <w:top w:val="single" w:color="D9D4C5" w:sz="4"/>
               <w:left w:val="single" w:color="D9D4C5" w:sz="4"/>
@@ -15344,7 +15486,7 @@
         </w:trPr>
         <w:tc>
           <w:tcPr>
-            <w:tcW w:type="dxa" w:w="869"/>
+            <w:tcW w:type="dxa" w:w="837"/>
             <w:tcBorders>
               <w:top w:val="single" w:color="D9D4C5" w:sz="4"/>
               <w:left w:val="single" w:color="D9D4C5" w:sz="4"/>
@@ -15377,7 +15519,7 @@
         </w:tc>
         <w:tc>
           <w:tcPr>
-            <w:tcW w:type="dxa" w:w="4739"/>
+            <w:tcW w:type="dxa" w:w="4568"/>
             <w:tcBorders>
               <w:top w:val="single" w:color="D9D4C5" w:sz="4"/>
               <w:left w:val="single" w:color="D9D4C5" w:sz="4"/>
@@ -15516,7 +15658,7 @@
         </w:tc>
         <w:tc>
           <w:tcPr>
-            <w:tcW w:type="dxa" w:w="1510"/>
+            <w:tcW w:type="dxa" w:w="1713"/>
             <w:tcBorders>
               <w:top w:val="single" w:color="D9D4C5" w:sz="4"/>
               <w:left w:val="single" w:color="D9D4C5" w:sz="4"/>
@@ -15554,7 +15696,7 @@
         </w:trPr>
         <w:tc>
           <w:tcPr>
-            <w:tcW w:type="dxa" w:w="869"/>
+            <w:tcW w:type="dxa" w:w="837"/>
             <w:tcBorders>
               <w:top w:val="single" w:color="D9D4C5" w:sz="4"/>
               <w:left w:val="single" w:color="D9D4C5" w:sz="4"/>
@@ -15586,7 +15728,7 @@
         </w:tc>
         <w:tc>
           <w:tcPr>
-            <w:tcW w:type="dxa" w:w="4739"/>
+            <w:tcW w:type="dxa" w:w="4568"/>
             <w:tcBorders>
               <w:top w:val="single" w:color="D9D4C5" w:sz="4"/>
               <w:left w:val="single" w:color="D9D4C5" w:sz="4"/>
@@ -15713,7 +15855,7 @@
         </w:tc>
         <w:tc>
           <w:tcPr>
-            <w:tcW w:type="dxa" w:w="1510"/>
+            <w:tcW w:type="dxa" w:w="1713"/>
             <w:tcBorders>
               <w:top w:val="single" w:color="D9D4C5" w:sz="4"/>
               <w:left w:val="single" w:color="D9D4C5" w:sz="4"/>
@@ -15750,7 +15892,7 @@
         </w:trPr>
         <w:tc>
           <w:tcPr>
-            <w:tcW w:type="dxa" w:w="869"/>
+            <w:tcW w:type="dxa" w:w="837"/>
             <w:tcBorders>
               <w:top w:val="single" w:color="D9D4C5" w:sz="4"/>
               <w:left w:val="single" w:color="D9D4C5" w:sz="4"/>
@@ -15783,7 +15925,7 @@
         </w:tc>
         <w:tc>
           <w:tcPr>
-            <w:tcW w:type="dxa" w:w="4739"/>
+            <w:tcW w:type="dxa" w:w="4568"/>
             <w:tcBorders>
               <w:top w:val="single" w:color="D9D4C5" w:sz="4"/>
               <w:left w:val="single" w:color="D9D4C5" w:sz="4"/>
@@ -15882,7 +16024,7 @@
         </w:tc>
         <w:tc>
           <w:tcPr>
-            <w:tcW w:type="dxa" w:w="1510"/>
+            <w:tcW w:type="dxa" w:w="1713"/>
             <w:tcBorders>
               <w:top w:val="single" w:color="D9D4C5" w:sz="4"/>
               <w:left w:val="single" w:color="D9D4C5" w:sz="4"/>
@@ -15920,7 +16062,7 @@
         </w:trPr>
         <w:tc>
           <w:tcPr>
-            <w:tcW w:type="dxa" w:w="869"/>
+            <w:tcW w:type="dxa" w:w="837"/>
             <w:tcBorders>
               <w:top w:val="single" w:color="D9D4C5" w:sz="4"/>
               <w:left w:val="single" w:color="D9D4C5" w:sz="4"/>
@@ -15952,7 +16094,7 @@
         </w:tc>
         <w:tc>
           <w:tcPr>
-            <w:tcW w:type="dxa" w:w="4739"/>
+            <w:tcW w:type="dxa" w:w="4568"/>
             <w:tcBorders>
               <w:top w:val="single" w:color="D9D4C5" w:sz="4"/>
               <w:left w:val="single" w:color="D9D4C5" w:sz="4"/>
@@ -16068,7 +16210,7 @@
         </w:tc>
         <w:tc>
           <w:tcPr>
-            <w:tcW w:type="dxa" w:w="1510"/>
+            <w:tcW w:type="dxa" w:w="1713"/>
             <w:tcBorders>
               <w:top w:val="single" w:color="D9D4C5" w:sz="4"/>
               <w:left w:val="single" w:color="D9D4C5" w:sz="4"/>
@@ -16105,7 +16247,7 @@
         </w:trPr>
         <w:tc>
           <w:tcPr>
-            <w:tcW w:type="dxa" w:w="869"/>
+            <w:tcW w:type="dxa" w:w="837"/>
             <w:tcBorders>
               <w:top w:val="single" w:color="D9D4C5" w:sz="4"/>
               <w:left w:val="single" w:color="D9D4C5" w:sz="4"/>
@@ -16138,7 +16280,7 @@
         </w:tc>
         <w:tc>
           <w:tcPr>
-            <w:tcW w:type="dxa" w:w="4739"/>
+            <w:tcW w:type="dxa" w:w="4568"/>
             <w:tcBorders>
               <w:top w:val="single" w:color="D9D4C5" w:sz="4"/>
               <w:left w:val="single" w:color="D9D4C5" w:sz="4"/>
@@ -16237,7 +16379,7 @@
         </w:tc>
         <w:tc>
           <w:tcPr>
-            <w:tcW w:type="dxa" w:w="1510"/>
+            <w:tcW w:type="dxa" w:w="1713"/>
             <w:tcBorders>
               <w:top w:val="single" w:color="D9D4C5" w:sz="4"/>
               <w:left w:val="single" w:color="D9D4C5" w:sz="4"/>
@@ -16880,7 +17022,7 @@
         <w:szCs w:val="16"/>
       </w:rPr>
       <w:tab/>
-      <w:t xml:space="preserve">DPIA Banca Dati Utenze · Rev. 1.1 · 30/10/2026</w:t>
+      <w:t xml:space="preserve">DPIA Banca Dati Utenze · Rev. 1.2 · 31/10/2026</w:t>
     </w:r>
   </w:p>
 </w:hdr>
@@ -16945,7 +17087,7 @@
         <w:szCs w:val="16"/>
       </w:rPr>
       <w:tab/>
-      <w:t xml:space="preserve">DPIA Banca Dati Utenze · Rev. 1.1 · 30/10/2026</w:t>
+      <w:t xml:space="preserve">DPIA Banca Dati Utenze · Rev. 1.2 · 31/10/2026</w:t>
     </w:r>
   </w:p>
 </w:hdr>

</xml_diff>